<commit_message>
Imlémentation complet du pipeline jusqu'à upload des artifacts
</commit_message>
<xml_diff>
--- a/jenkins_CI.docx
+++ b/jenkins_CI.docx
@@ -3,11 +3,78 @@
 <w:document xmlns:wpc="http://schemas.microsoft.com/office/word/2010/wordprocessingCanvas" xmlns:cx="http://schemas.microsoft.com/office/drawing/2014/chartex" xmlns:cx1="http://schemas.microsoft.com/office/drawing/2015/9/8/chartex" xmlns:cx2="http://schemas.microsoft.com/office/drawing/2015/10/21/chartex" xmlns:cx3="http://schemas.microsoft.com/office/drawing/2016/5/9/chartex" xmlns:cx4="http://schemas.microsoft.com/office/drawing/2016/5/10/chartex" xmlns:cx5="http://schemas.microsoft.com/office/drawing/2016/5/11/chartex" xmlns:cx6="http://schemas.microsoft.com/office/drawing/2016/5/12/chartex" xmlns:cx7="http://schemas.microsoft.com/office/drawing/2016/5/13/chartex" xmlns:cx8="http://schemas.microsoft.com/office/drawing/2016/5/14/chartex" xmlns:mc="http://schemas.openxmlformats.org/markup-compatibility/2006" xmlns:aink="http://schemas.microsoft.com/office/drawing/2016/ink" xmlns:am3d="http://schemas.microsoft.com/office/drawing/2017/model3d" xmlns:o="urn:schemas-microsoft-com:office:office" xmlns:oel="http://schemas.microsoft.com/office/2019/extlst" xmlns:r="http://schemas.openxmlformats.org/officeDocument/2006/relationships" xmlns:m="http://schemas.openxmlformats.org/officeDocument/2006/math" xmlns:v="urn:schemas-microsoft-com:vml" xmlns:wp14="http://schemas.microsoft.com/office/word/2010/wordprocessingDrawing" xmlns:wp="http://schemas.openxmlformats.org/drawingml/2006/wordprocessingDrawing" xmlns:w10="urn:schemas-microsoft-com:office:word" xmlns:w="http://schemas.openxmlformats.org/wordprocessingml/2006/main" xmlns:w14="http://schemas.microsoft.com/office/word/2010/wordml" xmlns:w15="http://schemas.microsoft.com/office/word/2012/wordml" xmlns:w16cex="http://schemas.microsoft.com/office/word/2018/wordml/cex" xmlns:w16cid="http://schemas.microsoft.com/office/word/2016/wordml/cid" xmlns:w16="http://schemas.microsoft.com/office/word/2018/wordml" xmlns:w16du="http://schemas.microsoft.com/office/word/2023/wordml/word16du" xmlns:w16sdtdh="http://schemas.microsoft.com/office/word/2020/wordml/sdtdatahash" xmlns:w16sdtfl="http://schemas.microsoft.com/office/word/2024/wordml/sdtformatlock" xmlns:w16se="http://schemas.microsoft.com/office/word/2015/wordml/symex" xmlns:wpg="http://schemas.microsoft.com/office/word/2010/wordprocessingGroup" xmlns:wpi="http://schemas.microsoft.com/office/word/2010/wordprocessingInk" xmlns:wne="http://schemas.microsoft.com/office/word/2006/wordml" xmlns:wps="http://schemas.microsoft.com/office/word/2010/wordprocessingShape" mc:Ignorable="w14 w15 w16se w16cid w16 w16cex w16sdtdh w16sdtfl w16du wp14">
   <w:body>
     <w:p>
-      <w:r>
-        <w:t>Ce document décrit la procédure de configuration d’un serveur Jenkins, Nexus, Sonarqube pour la mise en place d’un pipeline CI complet.</w:t>
-      </w:r>
-    </w:p>
-    <w:p/>
+      <w:pPr>
+        <w:rPr>
+          <w:lang w:val="en-US"/>
+        </w:rPr>
+      </w:pPr>
+      <w:r>
+        <w:rPr>
+          <w:lang w:val="en-US"/>
+        </w:rPr>
+        <w:t>This documentation is done to</w:t>
+      </w:r>
+      <w:r>
+        <w:rPr>
+          <w:lang w:val="en-US"/>
+        </w:rPr>
+        <w:t xml:space="preserve"> describe all the process for building this pipeline using Jenkins</w:t>
+      </w:r>
+    </w:p>
+    <w:p>
+      <w:pPr>
+        <w:rPr>
+          <w:lang w:val="en-US"/>
+        </w:rPr>
+      </w:pPr>
+      <w:r>
+        <w:rPr>
+          <w:lang w:val="en-US"/>
+        </w:rPr>
+        <w:drawing>
+          <wp:inline distT="0" distB="0" distL="0" distR="0" wp14:anchorId="033521DE" wp14:editId="74C326A9">
+            <wp:extent cx="5760720" cy="2733675"/>
+            <wp:effectExtent l="0" t="0" r="0" b="9525"/>
+            <wp:docPr id="1555656888" name="Image 1" descr="Une image contenant texte, capture d’écran, graphisme, conception&#10;&#10;Le contenu généré par l’IA peut être incorrect."/>
+            <wp:cNvGraphicFramePr>
+              <a:graphicFrameLocks xmlns:a="http://schemas.openxmlformats.org/drawingml/2006/main" noChangeAspect="1"/>
+            </wp:cNvGraphicFramePr>
+            <a:graphic xmlns:a="http://schemas.openxmlformats.org/drawingml/2006/main">
+              <a:graphicData uri="http://schemas.openxmlformats.org/drawingml/2006/picture">
+                <pic:pic xmlns:pic="http://schemas.openxmlformats.org/drawingml/2006/picture">
+                  <pic:nvPicPr>
+                    <pic:cNvPr id="1555656888" name="Image 1" descr="Une image contenant texte, capture d’écran, graphisme, conception&#10;&#10;Le contenu généré par l’IA peut être incorrect."/>
+                    <pic:cNvPicPr/>
+                  </pic:nvPicPr>
+                  <pic:blipFill>
+                    <a:blip r:embed="rId6"/>
+                    <a:stretch>
+                      <a:fillRect/>
+                    </a:stretch>
+                  </pic:blipFill>
+                  <pic:spPr>
+                    <a:xfrm>
+                      <a:off x="0" y="0"/>
+                      <a:ext cx="5760720" cy="2733675"/>
+                    </a:xfrm>
+                    <a:prstGeom prst="rect">
+                      <a:avLst/>
+                    </a:prstGeom>
+                  </pic:spPr>
+                </pic:pic>
+              </a:graphicData>
+            </a:graphic>
+          </wp:inline>
+        </w:drawing>
+      </w:r>
+    </w:p>
+    <w:p>
+      <w:pPr>
+        <w:rPr>
+          <w:lang w:val="en-US"/>
+        </w:rPr>
+      </w:pPr>
+    </w:p>
     <w:p>
       <w:pPr>
         <w:pStyle w:val="Titre1"/>
@@ -285,7 +352,7 @@
         </w:rPr>
         <w:t>o the doc of Jenkins and get the command to install Jenkins on a  ubuntu server : click here(</w:t>
       </w:r>
-      <w:hyperlink r:id="rId6" w:history="1">
+      <w:hyperlink r:id="rId7" w:history="1">
         <w:r>
           <w:rPr>
             <w:rStyle w:val="Lienhypertexte"/>
@@ -324,6 +391,7 @@
         <w:rPr>
           <w:lang w:val="en-US"/>
         </w:rPr>
+        <w:lastRenderedPageBreak/>
         <w:t>sudo apt update</w:t>
       </w:r>
     </w:p>
@@ -492,7 +560,7 @@
                     <pic:cNvPicPr/>
                   </pic:nvPicPr>
                   <pic:blipFill>
-                    <a:blip r:embed="rId7"/>
+                    <a:blip r:embed="rId8"/>
                     <a:stretch>
                       <a:fillRect/>
                     </a:stretch>
@@ -549,6 +617,7 @@
         <w:rPr>
           <w:lang w:val="en-US"/>
         </w:rPr>
+        <w:lastRenderedPageBreak/>
         <w:t>Check Jenkins status to be sure it’s running</w:t>
       </w:r>
     </w:p>
@@ -563,7 +632,6 @@
           <w:noProof/>
           <w:lang w:val="en-US"/>
         </w:rPr>
-        <w:lastRenderedPageBreak/>
         <w:drawing>
           <wp:inline distT="0" distB="0" distL="0" distR="0" wp14:anchorId="67411E79" wp14:editId="763A4E47">
             <wp:extent cx="5760720" cy="2904490"/>
@@ -580,7 +648,7 @@
                     <pic:cNvPicPr/>
                   </pic:nvPicPr>
                   <pic:blipFill>
-                    <a:blip r:embed="rId8"/>
+                    <a:blip r:embed="rId9"/>
                     <a:stretch>
                       <a:fillRect/>
                     </a:stretch>
@@ -641,7 +709,7 @@
                     <pic:cNvPicPr/>
                   </pic:nvPicPr>
                   <pic:blipFill>
-                    <a:blip r:embed="rId9"/>
+                    <a:blip r:embed="rId10"/>
                     <a:stretch>
                       <a:fillRect/>
                     </a:stretch>
@@ -734,7 +802,7 @@
                     <pic:cNvPicPr/>
                   </pic:nvPicPr>
                   <pic:blipFill>
-                    <a:blip r:embed="rId10"/>
+                    <a:blip r:embed="rId11"/>
                     <a:stretch>
                       <a:fillRect/>
                     </a:stretch>
@@ -795,7 +863,7 @@
                     <pic:cNvPicPr/>
                   </pic:nvPicPr>
                   <pic:blipFill>
-                    <a:blip r:embed="rId11"/>
+                    <a:blip r:embed="rId12"/>
                     <a:stretch>
                       <a:fillRect/>
                     </a:stretch>
@@ -869,7 +937,7 @@
                     <pic:cNvPicPr/>
                   </pic:nvPicPr>
                   <pic:blipFill>
-                    <a:blip r:embed="rId12"/>
+                    <a:blip r:embed="rId13"/>
                     <a:stretch>
                       <a:fillRect/>
                     </a:stretch>
@@ -918,7 +986,7 @@
                     <pic:cNvPicPr/>
                   </pic:nvPicPr>
                   <pic:blipFill>
-                    <a:blip r:embed="rId13"/>
+                    <a:blip r:embed="rId14"/>
                     <a:stretch>
                       <a:fillRect/>
                     </a:stretch>
@@ -979,7 +1047,7 @@
                     <pic:cNvPicPr/>
                   </pic:nvPicPr>
                   <pic:blipFill>
-                    <a:blip r:embed="rId14"/>
+                    <a:blip r:embed="rId15"/>
                     <a:stretch>
                       <a:fillRect/>
                     </a:stretch>
@@ -1041,7 +1109,7 @@
                     <pic:cNvPicPr/>
                   </pic:nvPicPr>
                   <pic:blipFill>
-                    <a:blip r:embed="rId15"/>
+                    <a:blip r:embed="rId16"/>
                     <a:stretch>
                       <a:fillRect/>
                     </a:stretch>
@@ -1088,6 +1156,202 @@
           <w:lang w:val="en-US"/>
         </w:rPr>
       </w:pPr>
+      <w:r>
+        <w:rPr>
+          <w:lang w:val="en-US"/>
+        </w:rPr>
+        <w:t>Installation of tools</w:t>
+      </w:r>
+    </w:p>
+    <w:p>
+      <w:pPr>
+        <w:rPr>
+          <w:lang w:val="en-US"/>
+        </w:rPr>
+      </w:pPr>
+      <w:r>
+        <w:rPr>
+          <w:lang w:val="en-US"/>
+        </w:rPr>
+        <w:t xml:space="preserve">In this step, we need to install some important tools four our exercise such as Maven and JDK. Follow the next steps : </w:t>
+      </w:r>
+    </w:p>
+    <w:p>
+      <w:pPr>
+        <w:rPr>
+          <w:lang w:val="en-US"/>
+        </w:rPr>
+      </w:pPr>
+      <w:r>
+        <w:rPr>
+          <w:lang w:val="en-US"/>
+        </w:rPr>
+        <w:t>Click to manage Jenkins</w:t>
+      </w:r>
+    </w:p>
+    <w:p>
+      <w:pPr>
+        <w:rPr>
+          <w:lang w:val="en-US"/>
+        </w:rPr>
+      </w:pPr>
+      <w:r>
+        <w:rPr>
+          <w:lang w:val="en-US"/>
+        </w:rPr>
+        <w:t>Click to tools</w:t>
+      </w:r>
+    </w:p>
+    <w:p>
+      <w:pPr>
+        <w:rPr>
+          <w:lang w:val="en-US"/>
+        </w:rPr>
+      </w:pPr>
+      <w:r>
+        <w:rPr>
+          <w:lang w:val="en-US"/>
+        </w:rPr>
+        <w:t>Scroll down and click to add JDK</w:t>
+      </w:r>
+    </w:p>
+    <w:p>
+      <w:pPr>
+        <w:rPr>
+          <w:lang w:val="en-US"/>
+        </w:rPr>
+      </w:pPr>
+      <w:r>
+        <w:rPr>
+          <w:lang w:val="en-US"/>
+        </w:rPr>
+        <w:t>Give the name JDK17</w:t>
+      </w:r>
+    </w:p>
+    <w:p>
+      <w:pPr>
+        <w:rPr>
+          <w:lang w:val="en-US"/>
+        </w:rPr>
+      </w:pPr>
+      <w:r>
+        <w:rPr>
+          <w:lang w:val="en-US"/>
+        </w:rPr>
+        <w:t>Uncheck install automatically if selected by default</w:t>
+      </w:r>
+    </w:p>
+    <w:p>
+      <w:pPr>
+        <w:rPr>
+          <w:lang w:val="en-US"/>
+        </w:rPr>
+      </w:pPr>
+      <w:r>
+        <w:rPr>
+          <w:lang w:val="en-US"/>
+        </w:rPr>
+        <w:t>To have Java_Home, connect to the server with ssl command</w:t>
+      </w:r>
+    </w:p>
+    <w:p>
+      <w:pPr>
+        <w:rPr>
+          <w:lang w:val="en-US"/>
+        </w:rPr>
+      </w:pPr>
+      <w:r>
+        <w:rPr>
+          <w:lang w:val="en-US"/>
+        </w:rPr>
+        <w:t>Switch to admin user : sudo -i</w:t>
+      </w:r>
+    </w:p>
+    <w:p>
+      <w:pPr>
+        <w:rPr>
+          <w:lang w:val="en-US"/>
+        </w:rPr>
+      </w:pPr>
+      <w:r>
+        <w:rPr>
+          <w:lang w:val="en-US"/>
+        </w:rPr>
+        <w:t>Update and install JDK17 : apt update &amp;&amp; apt install openjdk-17-jdk -y</w:t>
+      </w:r>
+    </w:p>
+    <w:p>
+      <w:pPr>
+        <w:rPr>
+          <w:lang w:val="en-US"/>
+        </w:rPr>
+      </w:pPr>
+      <w:r>
+        <w:rPr>
+          <w:lang w:val="en-US"/>
+        </w:rPr>
+        <w:t>Execute the command to have jdk home : ls /usr/lib/jvm/</w:t>
+      </w:r>
+    </w:p>
+    <w:p>
+      <w:pPr>
+        <w:rPr>
+          <w:lang w:val="en-US"/>
+        </w:rPr>
+      </w:pPr>
+      <w:r>
+        <w:rPr>
+          <w:lang w:val="en-US"/>
+        </w:rPr>
+        <w:t>You will see two line : java-17-openjdk-amd64 and java-21-openjdk-amd64</w:t>
+      </w:r>
+    </w:p>
+    <w:p>
+      <w:pPr>
+        <w:rPr>
+          <w:lang w:val="en-US"/>
+        </w:rPr>
+      </w:pPr>
+      <w:r>
+        <w:rPr>
+          <w:lang w:val="en-US"/>
+        </w:rPr>
+        <w:t>The full path of JDK17 is : /usr/lib/jvm/java-17-openjdk-amd64</w:t>
+      </w:r>
+    </w:p>
+    <w:p>
+      <w:pPr>
+        <w:rPr>
+          <w:lang w:val="en-US"/>
+        </w:rPr>
+      </w:pPr>
+      <w:r>
+        <w:rPr>
+          <w:lang w:val="en-US"/>
+        </w:rPr>
+        <w:t>Give a name and choose the version 3.9.x of Maven in the select list</w:t>
+      </w:r>
+    </w:p>
+    <w:p>
+      <w:pPr>
+        <w:rPr>
+          <w:lang w:val="en-US"/>
+        </w:rPr>
+      </w:pPr>
+      <w:r>
+        <w:rPr>
+          <w:lang w:val="en-US"/>
+        </w:rPr>
+        <w:lastRenderedPageBreak/>
+        <w:t>Click to save to finish</w:t>
+      </w:r>
+    </w:p>
+    <w:p>
+      <w:pPr>
+        <w:rPr>
+          <w:lang w:val="en-US"/>
+        </w:rPr>
+      </w:pPr>
     </w:p>
     <w:p>
       <w:pPr>
@@ -1277,106 +1541,106 @@
         <w:rPr>
           <w:lang w:val="en-US"/>
         </w:rPr>
+        <w:t xml:space="preserve">Launch the instance to get the server </w:t>
+      </w:r>
+    </w:p>
+    <w:p>
+      <w:pPr>
+        <w:rPr>
+          <w:lang w:val="en-US"/>
+        </w:rPr>
+      </w:pPr>
+    </w:p>
+    <w:p>
+      <w:pPr>
+        <w:rPr>
+          <w:lang w:val="en-US"/>
+        </w:rPr>
+      </w:pPr>
+      <w:r>
+        <w:rPr>
+          <w:lang w:val="en-US"/>
+        </w:rPr>
+        <w:t>To verify if everything is Ok, we will check nexus status, java -version et and the conf file in /opt/nexus/. So, we need  to :</w:t>
+      </w:r>
+    </w:p>
+    <w:p>
+      <w:pPr>
+        <w:rPr>
+          <w:lang w:val="en-US"/>
+        </w:rPr>
+      </w:pPr>
+      <w:r>
+        <w:rPr>
+          <w:lang w:val="en-US"/>
+        </w:rPr>
+        <w:t>Connect to the instance with ssh</w:t>
+      </w:r>
+    </w:p>
+    <w:p>
+      <w:pPr>
+        <w:rPr>
+          <w:lang w:val="en-US"/>
+        </w:rPr>
+      </w:pPr>
+      <w:r>
+        <w:rPr>
+          <w:lang w:val="en-US"/>
+        </w:rPr>
+        <w:t>Switch to root user : sudo -i</w:t>
+      </w:r>
+    </w:p>
+    <w:p>
+      <w:pPr>
+        <w:rPr>
+          <w:lang w:val="en-US"/>
+        </w:rPr>
+      </w:pPr>
+      <w:r>
+        <w:rPr>
+          <w:lang w:val="en-US"/>
+        </w:rPr>
+        <w:t>Check nexus status : systemctl status nexus the status is running</w:t>
+      </w:r>
+    </w:p>
+    <w:p>
+      <w:pPr>
+        <w:rPr>
+          <w:lang w:val="en-US"/>
+        </w:rPr>
+      </w:pPr>
+      <w:r>
+        <w:rPr>
+          <w:lang w:val="en-US"/>
+        </w:rPr>
+        <w:t>ls /opt/nexus/</w:t>
+      </w:r>
+    </w:p>
+    <w:p>
+      <w:pPr>
+        <w:rPr>
+          <w:lang w:val="en-US"/>
+        </w:rPr>
+      </w:pPr>
+      <w:r>
+        <w:rPr>
+          <w:lang w:val="en-US"/>
+        </w:rPr>
+        <w:t>java -version</w:t>
+      </w:r>
+    </w:p>
+    <w:p>
+      <w:pPr>
+        <w:rPr>
+          <w:lang w:val="en-US"/>
+        </w:rPr>
+      </w:pPr>
+      <w:r>
+        <w:rPr>
+          <w:noProof/>
+          <w:lang w:val="en-US"/>
+        </w:rPr>
         <w:lastRenderedPageBreak/>
-        <w:t xml:space="preserve">Launch the instance to get the server </w:t>
-      </w:r>
-    </w:p>
-    <w:p>
-      <w:pPr>
-        <w:rPr>
-          <w:lang w:val="en-US"/>
-        </w:rPr>
-      </w:pPr>
-    </w:p>
-    <w:p>
-      <w:pPr>
-        <w:rPr>
-          <w:lang w:val="en-US"/>
-        </w:rPr>
-      </w:pPr>
-      <w:r>
-        <w:rPr>
-          <w:lang w:val="en-US"/>
-        </w:rPr>
-        <w:t>To verify if everything is Ok, we will check nexus status, java -version et and the conf file in /opt/nexus/. So, we need  to :</w:t>
-      </w:r>
-    </w:p>
-    <w:p>
-      <w:pPr>
-        <w:rPr>
-          <w:lang w:val="en-US"/>
-        </w:rPr>
-      </w:pPr>
-      <w:r>
-        <w:rPr>
-          <w:lang w:val="en-US"/>
-        </w:rPr>
-        <w:t>Connect to the instance with ssh</w:t>
-      </w:r>
-    </w:p>
-    <w:p>
-      <w:pPr>
-        <w:rPr>
-          <w:lang w:val="en-US"/>
-        </w:rPr>
-      </w:pPr>
-      <w:r>
-        <w:rPr>
-          <w:lang w:val="en-US"/>
-        </w:rPr>
-        <w:t>Switch to root user : sudo -i</w:t>
-      </w:r>
-    </w:p>
-    <w:p>
-      <w:pPr>
-        <w:rPr>
-          <w:lang w:val="en-US"/>
-        </w:rPr>
-      </w:pPr>
-      <w:r>
-        <w:rPr>
-          <w:lang w:val="en-US"/>
-        </w:rPr>
-        <w:t>Check nexus status : systemctl status nexus the status is running</w:t>
-      </w:r>
-    </w:p>
-    <w:p>
-      <w:pPr>
-        <w:rPr>
-          <w:lang w:val="en-US"/>
-        </w:rPr>
-      </w:pPr>
-      <w:r>
-        <w:rPr>
-          <w:lang w:val="en-US"/>
-        </w:rPr>
-        <w:t>ls /opt/nexus/</w:t>
-      </w:r>
-    </w:p>
-    <w:p>
-      <w:pPr>
-        <w:rPr>
-          <w:lang w:val="en-US"/>
-        </w:rPr>
-      </w:pPr>
-      <w:r>
-        <w:rPr>
-          <w:lang w:val="en-US"/>
-        </w:rPr>
-        <w:t>java -version</w:t>
-      </w:r>
-    </w:p>
-    <w:p>
-      <w:pPr>
-        <w:rPr>
-          <w:lang w:val="en-US"/>
-        </w:rPr>
-      </w:pPr>
-      <w:r>
-        <w:rPr>
-          <w:noProof/>
-          <w:lang w:val="en-US"/>
-        </w:rPr>
         <w:drawing>
           <wp:inline distT="0" distB="0" distL="0" distR="0" wp14:anchorId="58A121D2" wp14:editId="70E9BA75">
             <wp:extent cx="5760720" cy="4048760"/>
@@ -1393,7 +1657,7 @@
                     <pic:cNvPicPr/>
                   </pic:nvPicPr>
                   <pic:blipFill>
-                    <a:blip r:embed="rId16"/>
+                    <a:blip r:embed="rId17"/>
                     <a:stretch>
                       <a:fillRect/>
                     </a:stretch>
@@ -1445,7 +1709,6 @@
           <w:noProof/>
           <w:lang w:val="en-US"/>
         </w:rPr>
-        <w:lastRenderedPageBreak/>
         <w:drawing>
           <wp:inline distT="0" distB="0" distL="0" distR="0" wp14:anchorId="53DC2CC9" wp14:editId="73B550ED">
             <wp:extent cx="5760720" cy="1383665"/>
@@ -1462,7 +1725,7 @@
                     <pic:cNvPicPr/>
                   </pic:nvPicPr>
                   <pic:blipFill>
-                    <a:blip r:embed="rId17"/>
+                    <a:blip r:embed="rId18"/>
                     <a:stretch>
                       <a:fillRect/>
                     </a:stretch>
@@ -1523,7 +1786,7 @@
                     <pic:cNvPicPr/>
                   </pic:nvPicPr>
                   <pic:blipFill>
-                    <a:blip r:embed="rId18"/>
+                    <a:blip r:embed="rId19"/>
                     <a:stretch>
                       <a:fillRect/>
                     </a:stretch>
@@ -1554,6 +1817,7 @@
         <w:rPr>
           <w:lang w:val="en-US"/>
         </w:rPr>
+        <w:lastRenderedPageBreak/>
         <w:t xml:space="preserve">In our case, the command to get the password for admin user is : </w:t>
       </w:r>
       <w:r>
@@ -1629,7 +1893,7 @@
                     <pic:cNvPicPr/>
                   </pic:nvPicPr>
                   <pic:blipFill>
-                    <a:blip r:embed="rId19"/>
+                    <a:blip r:embed="rId20"/>
                     <a:stretch>
                       <a:fillRect/>
                     </a:stretch>
@@ -1660,7 +1924,6 @@
         <w:rPr>
           <w:lang w:val="en-US"/>
         </w:rPr>
-        <w:lastRenderedPageBreak/>
         <w:t>Here we go, that is the admin dashboard</w:t>
       </w:r>
     </w:p>
@@ -1691,7 +1954,7 @@
                     <pic:cNvPicPr/>
                   </pic:nvPicPr>
                   <pic:blipFill>
-                    <a:blip r:embed="rId20"/>
+                    <a:blip r:embed="rId21"/>
                     <a:stretch>
                       <a:fillRect/>
                     </a:stretch>
@@ -1730,6 +1993,7 @@
         <w:rPr>
           <w:lang w:val="en-US"/>
         </w:rPr>
+        <w:lastRenderedPageBreak/>
         <w:t>Third</w:t>
       </w:r>
       <w:r>
@@ -2061,7 +2325,6 @@
         <w:rPr>
           <w:lang w:val="en-US"/>
         </w:rPr>
-        <w:lastRenderedPageBreak/>
         <w:t>Now check if sonar is running by using the browser (take the public IP address and paste in the browser, no need to specify port because the nginx front is running in port 80)</w:t>
       </w:r>
     </w:p>
@@ -2092,7 +2355,7 @@
                     <pic:cNvPicPr/>
                   </pic:nvPicPr>
                   <pic:blipFill>
-                    <a:blip r:embed="rId21"/>
+                    <a:blip r:embed="rId22"/>
                     <a:stretch>
                       <a:fillRect/>
                     </a:stretch>
@@ -2137,6 +2400,7 @@
           <w:noProof/>
           <w:lang w:val="en-US"/>
         </w:rPr>
+        <w:lastRenderedPageBreak/>
         <w:drawing>
           <wp:inline distT="0" distB="0" distL="0" distR="0" wp14:anchorId="5D5DA18F" wp14:editId="2388EDCD">
             <wp:extent cx="5760720" cy="2521585"/>
@@ -2153,7 +2417,7 @@
                     <pic:cNvPicPr/>
                   </pic:nvPicPr>
                   <pic:blipFill>
-                    <a:blip r:embed="rId22"/>
+                    <a:blip r:embed="rId23"/>
                     <a:stretch>
                       <a:fillRect/>
                     </a:stretch>
@@ -2227,7 +2491,7 @@
                     <pic:cNvPicPr/>
                   </pic:nvPicPr>
                   <pic:blipFill>
-                    <a:blip r:embed="rId23"/>
+                    <a:blip r:embed="rId24"/>
                     <a:stretch>
                       <a:fillRect/>
                     </a:stretch>
@@ -2254,29 +2518,4082 @@
           <w:lang w:val="en-US"/>
         </w:rPr>
       </w:pPr>
+    </w:p>
+    <w:p>
+      <w:pPr>
+        <w:rPr>
+          <w:lang w:val="en-US"/>
+        </w:rPr>
+      </w:pPr>
+      <w:r>
+        <w:rPr>
+          <w:lang w:val="en-US"/>
+        </w:rPr>
+        <w:t>Install Plugins for CI</w:t>
+      </w:r>
+      <w:r>
+        <w:rPr>
+          <w:lang w:val="en-US"/>
+        </w:rPr>
+        <w:br/>
+        <w:t xml:space="preserve">In this step, we gonna install plugins for Sonar, Nexus, BuildTimestamp, Pipeline Maven Integration. </w:t>
+      </w:r>
+      <w:r>
+        <w:rPr>
+          <w:lang w:val="en-US"/>
+        </w:rPr>
+        <w:br/>
+        <w:t>To do that, connect into the Jenkins Server, go to Manage Jenkins, click into Manage Plugins, switch to available, search sonarqube scanner, nexus artifact uploader, build timestamp, pipeline maven integration, pipeline utility steps</w:t>
+      </w:r>
+      <w:r>
+        <w:rPr>
+          <w:lang w:val="en-US"/>
+        </w:rPr>
+        <w:t xml:space="preserve"> </w:t>
+      </w:r>
+      <w:r>
+        <w:rPr>
+          <w:lang w:val="en-US"/>
+        </w:rPr>
+        <w:t>and check them all. Then click to install</w:t>
+      </w:r>
+    </w:p>
+    <w:p>
+      <w:pPr>
+        <w:rPr>
+          <w:lang w:val="en-US"/>
+        </w:rPr>
+      </w:pPr>
+      <w:r>
+        <w:rPr>
+          <w:lang w:val="en-US"/>
+        </w:rPr>
+        <w:t>The next is to execute a pipeline with the next code</w:t>
+      </w:r>
+    </w:p>
+    <w:p>
+      <w:pPr>
+        <w:rPr>
+          <w:lang w:val="en-US"/>
+        </w:rPr>
+      </w:pPr>
       <w:r>
         <w:rPr>
           <w:lang w:val="en-US"/>
         </w:rPr>
         <w:lastRenderedPageBreak/>
-        <w:t>Install Plugins for CI</w:t>
-      </w:r>
-      <w:r>
-        <w:rPr>
-          <w:lang w:val="en-US"/>
-        </w:rPr>
-        <w:br/>
-        <w:t xml:space="preserve">In this step, we gonna install plugins for Sonar, Nexus, BuildTimestamp, Pipeline Maven Integration. </w:t>
-      </w:r>
-      <w:r>
-        <w:rPr>
-          <w:lang w:val="en-US"/>
-        </w:rPr>
-        <w:br/>
-        <w:t>To do that, connect into the Jenkins Server, go to Manage Jenkins, click into Manage Plugins, switch to available, search sonarqube scanner, nexus artifact uploader, build timestamp, pipeline maven integration, pipeline utility stepsand check them all. Then click to install</w:t>
-      </w:r>
+        <w:t>pipeline {</w:t>
+      </w:r>
+      <w:r>
+        <w:rPr>
+          <w:lang w:val="en-US"/>
+        </w:rPr>
+        <w:br/>
+        <w:t xml:space="preserve">    agent any</w:t>
+      </w:r>
+      <w:r>
+        <w:rPr>
+          <w:lang w:val="en-US"/>
+        </w:rPr>
+        <w:br/>
+      </w:r>
+      <w:r>
+        <w:rPr>
+          <w:lang w:val="en-US"/>
+        </w:rPr>
+        <w:br/>
+        <w:t xml:space="preserve">    tools {</w:t>
+      </w:r>
+      <w:r>
+        <w:rPr>
+          <w:lang w:val="en-US"/>
+        </w:rPr>
+        <w:br/>
+        <w:t xml:space="preserve">        maven "MAVEN3.9"</w:t>
+      </w:r>
+      <w:r>
+        <w:rPr>
+          <w:lang w:val="en-US"/>
+        </w:rPr>
+        <w:br/>
+        <w:t xml:space="preserve">        jdk "JDK17"</w:t>
+      </w:r>
+      <w:r>
+        <w:rPr>
+          <w:lang w:val="en-US"/>
+        </w:rPr>
+        <w:br/>
+        <w:t xml:space="preserve">    }</w:t>
+      </w:r>
+      <w:r>
+        <w:rPr>
+          <w:lang w:val="en-US"/>
+        </w:rPr>
+        <w:br/>
+      </w:r>
+      <w:r>
+        <w:rPr>
+          <w:lang w:val="en-US"/>
+        </w:rPr>
+        <w:br/>
+        <w:t xml:space="preserve">    stages {</w:t>
+      </w:r>
+      <w:r>
+        <w:rPr>
+          <w:lang w:val="en-US"/>
+        </w:rPr>
+        <w:br/>
+        <w:t xml:space="preserve">        stage('Fetch code') {</w:t>
+      </w:r>
+      <w:r>
+        <w:rPr>
+          <w:lang w:val="en-US"/>
+        </w:rPr>
+        <w:br/>
+        <w:t xml:space="preserve">            steps {</w:t>
+      </w:r>
+      <w:r>
+        <w:rPr>
+          <w:lang w:val="en-US"/>
+        </w:rPr>
+        <w:br/>
+        <w:t xml:space="preserve">                git </w:t>
+      </w:r>
+      <w:r>
+        <w:rPr>
+          <w:i/>
+          <w:iCs/>
+          <w:lang w:val="en-US"/>
+        </w:rPr>
+        <w:t>branch</w:t>
+      </w:r>
+      <w:r>
+        <w:rPr>
+          <w:lang w:val="en-US"/>
+        </w:rPr>
+        <w:t>: 'jenkins_CI',</w:t>
+      </w:r>
+      <w:r>
+        <w:rPr>
+          <w:lang w:val="en-US"/>
+        </w:rPr>
+        <w:br/>
+        <w:t xml:space="preserve">                </w:t>
+      </w:r>
+      <w:r>
+        <w:rPr>
+          <w:i/>
+          <w:iCs/>
+          <w:lang w:val="en-US"/>
+        </w:rPr>
+        <w:t>url</w:t>
+      </w:r>
+      <w:r>
+        <w:rPr>
+          <w:lang w:val="en-US"/>
+        </w:rPr>
+        <w:t>: 'https://github.com/Sougoumay/vprofile-project'</w:t>
+      </w:r>
+      <w:r>
+        <w:rPr>
+          <w:lang w:val="en-US"/>
+        </w:rPr>
+        <w:br/>
+        <w:t xml:space="preserve">            }</w:t>
+      </w:r>
+      <w:r>
+        <w:rPr>
+          <w:lang w:val="en-US"/>
+        </w:rPr>
+        <w:br/>
+        <w:t xml:space="preserve">        }</w:t>
+      </w:r>
+      <w:r>
+        <w:rPr>
+          <w:lang w:val="en-US"/>
+        </w:rPr>
+        <w:br/>
+      </w:r>
+      <w:r>
+        <w:rPr>
+          <w:lang w:val="en-US"/>
+        </w:rPr>
+        <w:br/>
+        <w:t xml:space="preserve">        stage('Unit Test') {</w:t>
+      </w:r>
+      <w:r>
+        <w:rPr>
+          <w:lang w:val="en-US"/>
+        </w:rPr>
+        <w:br/>
+        <w:t xml:space="preserve">            steps {</w:t>
+      </w:r>
+      <w:r>
+        <w:rPr>
+          <w:lang w:val="en-US"/>
+        </w:rPr>
+        <w:br/>
+        <w:t xml:space="preserve">                sh 'mvn test'</w:t>
+      </w:r>
+      <w:r>
+        <w:rPr>
+          <w:lang w:val="en-US"/>
+        </w:rPr>
+        <w:br/>
+        <w:t xml:space="preserve">            }</w:t>
+      </w:r>
+      <w:r>
+        <w:rPr>
+          <w:lang w:val="en-US"/>
+        </w:rPr>
+        <w:br/>
+        <w:t xml:space="preserve">        }</w:t>
+      </w:r>
+      <w:r>
+        <w:rPr>
+          <w:lang w:val="en-US"/>
+        </w:rPr>
+        <w:br/>
+      </w:r>
+      <w:r>
+        <w:rPr>
+          <w:lang w:val="en-US"/>
+        </w:rPr>
+        <w:br/>
+        <w:t xml:space="preserve">        stage('Build') {</w:t>
+      </w:r>
+      <w:r>
+        <w:rPr>
+          <w:lang w:val="en-US"/>
+        </w:rPr>
+        <w:br/>
+        <w:t xml:space="preserve">            steps {</w:t>
+      </w:r>
+      <w:r>
+        <w:rPr>
+          <w:lang w:val="en-US"/>
+        </w:rPr>
+        <w:br/>
+        <w:t xml:space="preserve">                sh 'mvn install -DskipTests'</w:t>
+      </w:r>
+      <w:r>
+        <w:rPr>
+          <w:lang w:val="en-US"/>
+        </w:rPr>
+        <w:br/>
+        <w:t xml:space="preserve">            }</w:t>
+      </w:r>
+      <w:r>
+        <w:rPr>
+          <w:lang w:val="en-US"/>
+        </w:rPr>
+        <w:br/>
+        <w:t xml:space="preserve">            post {</w:t>
+      </w:r>
+      <w:r>
+        <w:rPr>
+          <w:lang w:val="en-US"/>
+        </w:rPr>
+        <w:br/>
+        <w:t xml:space="preserve">                success {</w:t>
+      </w:r>
+      <w:r>
+        <w:rPr>
+          <w:lang w:val="en-US"/>
+        </w:rPr>
+        <w:br/>
+        <w:t xml:space="preserve">                    echo 'Archiving artifact'</w:t>
+      </w:r>
+      <w:r>
+        <w:rPr>
+          <w:lang w:val="en-US"/>
+        </w:rPr>
+        <w:br/>
+        <w:t xml:space="preserve">                    archiveArtifacts </w:t>
+      </w:r>
+      <w:r>
+        <w:rPr>
+          <w:i/>
+          <w:iCs/>
+          <w:lang w:val="en-US"/>
+        </w:rPr>
+        <w:t>artifacts</w:t>
+      </w:r>
+      <w:r>
+        <w:rPr>
+          <w:lang w:val="en-US"/>
+        </w:rPr>
+        <w:t>: '**/*.war'</w:t>
+      </w:r>
+      <w:r>
+        <w:rPr>
+          <w:lang w:val="en-US"/>
+        </w:rPr>
+        <w:br/>
+      </w:r>
+      <w:r>
+        <w:rPr>
+          <w:lang w:val="en-US"/>
+        </w:rPr>
+        <w:br/>
+        <w:t xml:space="preserve">                }</w:t>
+      </w:r>
+      <w:r>
+        <w:rPr>
+          <w:lang w:val="en-US"/>
+        </w:rPr>
+        <w:br/>
+        <w:t xml:space="preserve">            }</w:t>
+      </w:r>
+      <w:r>
+        <w:rPr>
+          <w:lang w:val="en-US"/>
+        </w:rPr>
+        <w:br/>
+        <w:t xml:space="preserve">        }</w:t>
+      </w:r>
+      <w:r>
+        <w:rPr>
+          <w:lang w:val="en-US"/>
+        </w:rPr>
+        <w:br/>
+        <w:t xml:space="preserve">    }</w:t>
+      </w:r>
+      <w:r>
+        <w:rPr>
+          <w:lang w:val="en-US"/>
+        </w:rPr>
+        <w:br/>
+        <w:t>}</w:t>
+      </w:r>
+    </w:p>
+    <w:p>
+      <w:pPr>
+        <w:rPr>
+          <w:lang w:val="en-US"/>
+        </w:rPr>
+      </w:pPr>
+    </w:p>
+    <w:p>
+      <w:pPr>
+        <w:rPr>
+          <w:lang w:val="en-US"/>
+        </w:rPr>
+      </w:pPr>
+      <w:r>
+        <w:rPr>
+          <w:lang w:val="en-US"/>
+        </w:rPr>
+        <w:t>Go to the dashboard (Jenkins in web)</w:t>
+      </w:r>
+    </w:p>
+    <w:p>
+      <w:pPr>
+        <w:rPr>
+          <w:lang w:val="en-US"/>
+        </w:rPr>
+      </w:pPr>
+      <w:r>
+        <w:rPr>
+          <w:lang w:val="en-US"/>
+        </w:rPr>
+        <w:t>New Item</w:t>
+      </w:r>
+    </w:p>
+    <w:p>
+      <w:pPr>
+        <w:rPr>
+          <w:lang w:val="en-US"/>
+        </w:rPr>
+      </w:pPr>
+      <w:r>
+        <w:rPr>
+          <w:lang w:val="en-US"/>
+        </w:rPr>
+        <w:lastRenderedPageBreak/>
+        <w:t>Give a name</w:t>
+      </w:r>
+    </w:p>
+    <w:p>
+      <w:pPr>
+        <w:rPr>
+          <w:lang w:val="en-US"/>
+        </w:rPr>
+      </w:pPr>
+      <w:r>
+        <w:rPr>
+          <w:lang w:val="en-US"/>
+        </w:rPr>
+        <w:t>Select pipeline</w:t>
+      </w:r>
+    </w:p>
+    <w:p>
+      <w:pPr>
+        <w:rPr>
+          <w:lang w:val="en-US"/>
+        </w:rPr>
+      </w:pPr>
+      <w:r>
+        <w:rPr>
+          <w:lang w:val="en-US"/>
+        </w:rPr>
+        <w:t>Click OK</w:t>
+      </w:r>
+    </w:p>
+    <w:p>
+      <w:pPr>
+        <w:rPr>
+          <w:lang w:val="en-US"/>
+        </w:rPr>
+      </w:pPr>
+      <w:r>
+        <w:rPr>
+          <w:lang w:val="en-US"/>
+        </w:rPr>
+        <w:t>Paste the code on the script input</w:t>
+      </w:r>
+    </w:p>
+    <w:p>
+      <w:pPr>
+        <w:rPr>
+          <w:lang w:val="en-US"/>
+        </w:rPr>
+      </w:pPr>
+      <w:r>
+        <w:rPr>
+          <w:lang w:val="en-US"/>
+        </w:rPr>
+        <w:t>Execute</w:t>
+      </w:r>
+    </w:p>
+    <w:p>
+      <w:pPr>
+        <w:rPr>
+          <w:lang w:val="en-US"/>
+        </w:rPr>
+      </w:pPr>
+      <w:r>
+        <w:rPr>
+          <w:lang w:val="en-US"/>
+        </w:rPr>
+        <w:t>Save</w:t>
+      </w:r>
+    </w:p>
+    <w:p>
+      <w:pPr>
+        <w:rPr>
+          <w:lang w:val="en-US"/>
+        </w:rPr>
+      </w:pPr>
+      <w:r>
+        <w:rPr>
+          <w:lang w:val="en-US"/>
+        </w:rPr>
+        <w:t>Launch the build</w:t>
+      </w:r>
+      <w:r>
+        <w:rPr>
+          <w:lang w:val="en-US"/>
+        </w:rPr>
+        <w:br/>
+      </w:r>
+    </w:p>
+    <w:p>
+      <w:pPr>
+        <w:rPr>
+          <w:lang w:val="en-US"/>
+        </w:rPr>
+      </w:pPr>
+      <w:r>
+        <w:rPr>
+          <w:lang w:val="en-US"/>
+        </w:rPr>
+        <w:br/>
+        <w:t>Code Analysis</w:t>
+      </w:r>
+    </w:p>
+    <w:p>
+      <w:pPr>
+        <w:rPr>
+          <w:lang w:val="en-US"/>
+        </w:rPr>
+      </w:pPr>
+      <w:r>
+        <w:rPr>
+          <w:lang w:val="en-US"/>
+        </w:rPr>
+        <w:t>SonarQube Scanner tool</w:t>
+      </w:r>
+    </w:p>
+    <w:p>
+      <w:pPr>
+        <w:rPr>
+          <w:lang w:val="en-US"/>
+        </w:rPr>
+      </w:pPr>
+      <w:r>
+        <w:rPr>
+          <w:lang w:val="en-US"/>
+        </w:rPr>
+        <w:t>Sonar server details</w:t>
+      </w:r>
+    </w:p>
+    <w:p>
+      <w:pPr>
+        <w:rPr>
+          <w:lang w:val="en-US"/>
+        </w:rPr>
+      </w:pPr>
+      <w:r>
+        <w:rPr>
+          <w:lang w:val="en-US"/>
+        </w:rPr>
+        <w:t>From sonar we need token</w:t>
+      </w:r>
+    </w:p>
+    <w:p>
+      <w:pPr>
+        <w:rPr>
+          <w:lang w:val="en-US"/>
+        </w:rPr>
+      </w:pPr>
+      <w:r>
+        <w:rPr>
+          <w:lang w:val="en-US"/>
+        </w:rPr>
+        <w:t>To analyze the code with SonarQube, Jenkins and SonarQube must be in run. The we need three things :</w:t>
+      </w:r>
+    </w:p>
+    <w:p>
+      <w:pPr>
+        <w:rPr>
+          <w:lang w:val="en-US"/>
+        </w:rPr>
+      </w:pPr>
+      <w:r>
+        <w:rPr>
+          <w:lang w:val="en-US"/>
+        </w:rPr>
+        <w:t>SonarQube Scanner tool in Jenkins</w:t>
+      </w:r>
+    </w:p>
+    <w:p>
+      <w:pPr>
+        <w:rPr>
+          <w:lang w:val="en-US"/>
+        </w:rPr>
+      </w:pPr>
+      <w:r>
+        <w:rPr>
+          <w:lang w:val="en-US"/>
+        </w:rPr>
+        <w:t>Sonar server details in Jenkins</w:t>
+      </w:r>
+    </w:p>
+    <w:p>
+      <w:pPr>
+        <w:rPr>
+          <w:lang w:val="en-US"/>
+        </w:rPr>
+      </w:pPr>
+      <w:r>
+        <w:rPr>
+          <w:lang w:val="en-US"/>
+        </w:rPr>
+        <w:t>Token from Sonarqube to authorize Jenkins taking actions</w:t>
+      </w:r>
+      <w:r>
+        <w:rPr>
+          <w:lang w:val="en-US"/>
+        </w:rPr>
+        <w:br/>
+      </w:r>
+      <w:r>
+        <w:rPr>
+          <w:lang w:val="en-US"/>
+        </w:rPr>
+        <w:br/>
+        <w:t>First of all, to install Sonarqube Scanner, go to Jenkins dashboard</w:t>
+      </w:r>
+    </w:p>
+    <w:p>
+      <w:pPr>
+        <w:rPr>
+          <w:lang w:val="en-US"/>
+        </w:rPr>
+      </w:pPr>
+      <w:r>
+        <w:rPr>
+          <w:lang w:val="en-US"/>
+        </w:rPr>
+        <w:t>Click to manage Jenkins</w:t>
+      </w:r>
+    </w:p>
+    <w:p>
+      <w:pPr>
+        <w:rPr>
+          <w:lang w:val="en-US"/>
+        </w:rPr>
+      </w:pPr>
+      <w:r>
+        <w:rPr>
+          <w:lang w:val="en-US"/>
+        </w:rPr>
+        <w:t>Click to tools</w:t>
+      </w:r>
+    </w:p>
+    <w:p>
+      <w:pPr>
+        <w:rPr>
+          <w:lang w:val="en-US"/>
+        </w:rPr>
+      </w:pPr>
+      <w:r>
+        <w:rPr>
+          <w:lang w:val="en-US"/>
+        </w:rPr>
+        <w:t>Scroll down until SonarQube scanner and click to Add SonarQube Scanner</w:t>
+      </w:r>
+    </w:p>
+    <w:p>
+      <w:pPr>
+        <w:rPr>
+          <w:lang w:val="en-US"/>
+        </w:rPr>
+      </w:pPr>
+      <w:r>
+        <w:rPr>
+          <w:lang w:val="en-US"/>
+        </w:rPr>
+        <w:t>Give the name Sonar6.2</w:t>
+      </w:r>
+    </w:p>
+    <w:p>
+      <w:pPr>
+        <w:rPr>
+          <w:lang w:val="en-US"/>
+        </w:rPr>
+      </w:pPr>
+      <w:r>
+        <w:rPr>
+          <w:lang w:val="en-US"/>
+        </w:rPr>
+        <w:t>Choose the version 6.2.1.4610</w:t>
+      </w:r>
+    </w:p>
+    <w:p>
+      <w:pPr>
+        <w:rPr>
+          <w:lang w:val="en-US"/>
+        </w:rPr>
+      </w:pPr>
+      <w:r>
+        <w:rPr>
+          <w:noProof/>
+          <w:lang w:val="en-US"/>
+        </w:rPr>
+        <w:drawing>
+          <wp:inline distT="0" distB="0" distL="0" distR="0" wp14:anchorId="622B9E30" wp14:editId="13279523">
+            <wp:extent cx="4175760" cy="1457742"/>
+            <wp:effectExtent l="0" t="0" r="0" b="9525"/>
+            <wp:docPr id="1857130615" name="Image 1" descr="Une image contenant texte, ligne, Police, nombre&#10;&#10;Le contenu généré par l’IA peut être incorrect."/>
+            <wp:cNvGraphicFramePr>
+              <a:graphicFrameLocks xmlns:a="http://schemas.openxmlformats.org/drawingml/2006/main" noChangeAspect="1"/>
+            </wp:cNvGraphicFramePr>
+            <a:graphic xmlns:a="http://schemas.openxmlformats.org/drawingml/2006/main">
+              <a:graphicData uri="http://schemas.openxmlformats.org/drawingml/2006/picture">
+                <pic:pic xmlns:pic="http://schemas.openxmlformats.org/drawingml/2006/picture">
+                  <pic:nvPicPr>
+                    <pic:cNvPr id="1857130615" name="Image 1" descr="Une image contenant texte, ligne, Police, nombre&#10;&#10;Le contenu généré par l’IA peut être incorrect."/>
+                    <pic:cNvPicPr/>
+                  </pic:nvPicPr>
+                  <pic:blipFill>
+                    <a:blip r:embed="rId25"/>
+                    <a:stretch>
+                      <a:fillRect/>
+                    </a:stretch>
+                  </pic:blipFill>
+                  <pic:spPr>
+                    <a:xfrm>
+                      <a:off x="0" y="0"/>
+                      <a:ext cx="4182316" cy="1460031"/>
+                    </a:xfrm>
+                    <a:prstGeom prst="rect">
+                      <a:avLst/>
+                    </a:prstGeom>
+                  </pic:spPr>
+                </pic:pic>
+              </a:graphicData>
+            </a:graphic>
+          </wp:inline>
+        </w:drawing>
+      </w:r>
+    </w:p>
+    <w:p>
+      <w:pPr>
+        <w:rPr>
+          <w:lang w:val="en-US"/>
+        </w:rPr>
+      </w:pPr>
+      <w:r>
+        <w:rPr>
+          <w:lang w:val="en-US"/>
+        </w:rPr>
+        <w:lastRenderedPageBreak/>
+        <w:t>In the next step, we need to store Sonarqube Server details in the Jenkins. SonarQube Server tool will scan the code and then we need to upload result to sonarqube server. For that we need to store the information of sonarqube server. Follow the next steps</w:t>
+      </w:r>
+    </w:p>
+    <w:p>
+      <w:pPr>
+        <w:rPr>
+          <w:lang w:val="en-US"/>
+        </w:rPr>
+      </w:pPr>
+      <w:r>
+        <w:rPr>
+          <w:lang w:val="en-US"/>
+        </w:rPr>
+        <w:t>Go to manage Jenkins</w:t>
+      </w:r>
+    </w:p>
+    <w:p>
+      <w:pPr>
+        <w:rPr>
+          <w:lang w:val="en-US"/>
+        </w:rPr>
+      </w:pPr>
+      <w:r>
+        <w:rPr>
+          <w:lang w:val="en-US"/>
+        </w:rPr>
+        <w:t>Go to System</w:t>
+      </w:r>
+    </w:p>
+    <w:p>
+      <w:pPr>
+        <w:rPr>
+          <w:lang w:val="en-US"/>
+        </w:rPr>
+      </w:pPr>
+      <w:r>
+        <w:rPr>
+          <w:lang w:val="en-US"/>
+        </w:rPr>
+        <w:t>Scroll down until you find Sonarqube server</w:t>
+      </w:r>
+    </w:p>
+    <w:p>
+      <w:pPr>
+        <w:rPr>
+          <w:lang w:val="en-US"/>
+        </w:rPr>
+      </w:pPr>
+      <w:r>
+        <w:rPr>
+          <w:lang w:val="en-US"/>
+        </w:rPr>
+        <w:t>Check environment variables</w:t>
+      </w:r>
+    </w:p>
+    <w:p>
+      <w:pPr>
+        <w:rPr>
+          <w:lang w:val="en-US"/>
+        </w:rPr>
+      </w:pPr>
+      <w:r>
+        <w:rPr>
+          <w:lang w:val="en-US"/>
+        </w:rPr>
+        <w:t>Click on Add Sonarqube</w:t>
+      </w:r>
+    </w:p>
+    <w:p>
+      <w:pPr>
+        <w:rPr>
+          <w:lang w:val="en-US"/>
+        </w:rPr>
+      </w:pPr>
+      <w:r>
+        <w:rPr>
+          <w:lang w:val="en-US"/>
+        </w:rPr>
+        <w:t>Give the name sonarserver</w:t>
+      </w:r>
+    </w:p>
+    <w:p>
+      <w:pPr>
+        <w:rPr>
+          <w:lang w:val="en-US"/>
+        </w:rPr>
+      </w:pPr>
+      <w:r>
+        <w:rPr>
+          <w:lang w:val="en-US"/>
+        </w:rPr>
+        <w:t>Server url will be the private ip of sonar, go to AWS, copy and paste (</w:t>
+      </w:r>
+      <w:hyperlink r:id="rId26" w:history="1">
+        <w:r>
+          <w:rPr>
+            <w:rStyle w:val="Lienhypertexte"/>
+            <w:lang w:val="en-US"/>
+          </w:rPr>
+          <w:t>http://private-ip</w:t>
+        </w:r>
+      </w:hyperlink>
+      <w:r>
+        <w:rPr>
+          <w:lang w:val="en-US"/>
+        </w:rPr>
+        <w:t>)</w:t>
+      </w:r>
+    </w:p>
+    <w:p>
+      <w:pPr>
+        <w:rPr>
+          <w:lang w:val="en-US"/>
+        </w:rPr>
+      </w:pPr>
+      <w:r>
+        <w:rPr>
+          <w:lang w:val="en-US"/>
+        </w:rPr>
+        <w:t>For the authentication we need Sonar token</w:t>
+      </w:r>
+    </w:p>
+    <w:p>
+      <w:pPr>
+        <w:rPr>
+          <w:lang w:val="en-US"/>
+        </w:rPr>
+      </w:pPr>
+      <w:r>
+        <w:rPr>
+          <w:lang w:val="en-US"/>
+        </w:rPr>
+        <w:t>Now connect to sonar server with public ip in the browser</w:t>
+      </w:r>
+    </w:p>
+    <w:p>
+      <w:pPr>
+        <w:rPr>
+          <w:lang w:val="en-US"/>
+        </w:rPr>
+      </w:pPr>
+      <w:r>
+        <w:rPr>
+          <w:lang w:val="en-US"/>
+        </w:rPr>
+        <w:t>Login with your credentials (admin and admin123)</w:t>
+      </w:r>
+    </w:p>
+    <w:p>
+      <w:pPr>
+        <w:rPr>
+          <w:lang w:val="en-US"/>
+        </w:rPr>
+      </w:pPr>
+      <w:r>
+        <w:rPr>
+          <w:lang w:val="en-US"/>
+        </w:rPr>
+        <w:t>In the top right click to the symbol A</w:t>
+      </w:r>
+    </w:p>
+    <w:p>
+      <w:pPr>
+        <w:rPr>
+          <w:lang w:val="en-US"/>
+        </w:rPr>
+      </w:pPr>
+      <w:r>
+        <w:rPr>
+          <w:lang w:val="en-US"/>
+        </w:rPr>
+        <w:t>Click to my account</w:t>
+      </w:r>
+    </w:p>
+    <w:p>
+      <w:pPr>
+        <w:rPr>
+          <w:lang w:val="en-US"/>
+        </w:rPr>
+      </w:pPr>
+      <w:r>
+        <w:rPr>
+          <w:lang w:val="en-US"/>
+        </w:rPr>
+        <w:t>Click to security</w:t>
+      </w:r>
+    </w:p>
+    <w:p>
+      <w:pPr>
+        <w:rPr>
+          <w:lang w:val="en-US"/>
+        </w:rPr>
+      </w:pPr>
+      <w:r>
+        <w:rPr>
+          <w:lang w:val="en-US"/>
+        </w:rPr>
+        <w:t>Give the name Jenkins</w:t>
+      </w:r>
+    </w:p>
+    <w:p>
+      <w:pPr>
+        <w:rPr>
+          <w:lang w:val="en-US"/>
+        </w:rPr>
+      </w:pPr>
+      <w:r>
+        <w:rPr>
+          <w:lang w:val="en-US"/>
+        </w:rPr>
+        <w:t xml:space="preserve">Select User Token </w:t>
+      </w:r>
+    </w:p>
+    <w:p>
+      <w:pPr>
+        <w:rPr>
+          <w:lang w:val="en-US"/>
+        </w:rPr>
+      </w:pPr>
+      <w:r>
+        <w:rPr>
+          <w:lang w:val="en-US"/>
+        </w:rPr>
+        <w:t>Then Generate</w:t>
+      </w:r>
+    </w:p>
+    <w:p>
+      <w:pPr>
+        <w:rPr>
+          <w:lang w:val="en-US"/>
+        </w:rPr>
+      </w:pPr>
+      <w:r>
+        <w:rPr>
+          <w:noProof/>
+          <w:lang w:val="en-US"/>
+        </w:rPr>
+        <w:drawing>
+          <wp:inline distT="0" distB="0" distL="0" distR="0" wp14:anchorId="37C507A0" wp14:editId="77B5731B">
+            <wp:extent cx="5760720" cy="1994535"/>
+            <wp:effectExtent l="0" t="0" r="0" b="5715"/>
+            <wp:docPr id="930771428" name="Image 1" descr="Une image contenant texte, logiciel, Icône d’ordinateur, Page web&#10;&#10;Le contenu généré par l’IA peut être incorrect."/>
+            <wp:cNvGraphicFramePr>
+              <a:graphicFrameLocks xmlns:a="http://schemas.openxmlformats.org/drawingml/2006/main" noChangeAspect="1"/>
+            </wp:cNvGraphicFramePr>
+            <a:graphic xmlns:a="http://schemas.openxmlformats.org/drawingml/2006/main">
+              <a:graphicData uri="http://schemas.openxmlformats.org/drawingml/2006/picture">
+                <pic:pic xmlns:pic="http://schemas.openxmlformats.org/drawingml/2006/picture">
+                  <pic:nvPicPr>
+                    <pic:cNvPr id="930771428" name="Image 1" descr="Une image contenant texte, logiciel, Icône d’ordinateur, Page web&#10;&#10;Le contenu généré par l’IA peut être incorrect."/>
+                    <pic:cNvPicPr/>
+                  </pic:nvPicPr>
+                  <pic:blipFill>
+                    <a:blip r:embed="rId27"/>
+                    <a:stretch>
+                      <a:fillRect/>
+                    </a:stretch>
+                  </pic:blipFill>
+                  <pic:spPr>
+                    <a:xfrm>
+                      <a:off x="0" y="0"/>
+                      <a:ext cx="5760720" cy="1994535"/>
+                    </a:xfrm>
+                    <a:prstGeom prst="rect">
+                      <a:avLst/>
+                    </a:prstGeom>
+                  </pic:spPr>
+                </pic:pic>
+              </a:graphicData>
+            </a:graphic>
+          </wp:inline>
+        </w:drawing>
+      </w:r>
+    </w:p>
+    <w:p>
+      <w:pPr>
+        <w:rPr>
+          <w:lang w:val="en-US"/>
+        </w:rPr>
+      </w:pPr>
+      <w:r>
+        <w:rPr>
+          <w:noProof/>
+          <w:lang w:val="en-US"/>
+        </w:rPr>
+        <w:lastRenderedPageBreak/>
+        <w:drawing>
+          <wp:inline distT="0" distB="0" distL="0" distR="0" wp14:anchorId="797599FE" wp14:editId="2B39342E">
+            <wp:extent cx="5760720" cy="1186815"/>
+            <wp:effectExtent l="0" t="0" r="0" b="0"/>
+            <wp:docPr id="1922328262" name="Image 1" descr="Une image contenant texte, Police, ligne, nombre&#10;&#10;Le contenu généré par l’IA peut être incorrect."/>
+            <wp:cNvGraphicFramePr>
+              <a:graphicFrameLocks xmlns:a="http://schemas.openxmlformats.org/drawingml/2006/main" noChangeAspect="1"/>
+            </wp:cNvGraphicFramePr>
+            <a:graphic xmlns:a="http://schemas.openxmlformats.org/drawingml/2006/main">
+              <a:graphicData uri="http://schemas.openxmlformats.org/drawingml/2006/picture">
+                <pic:pic xmlns:pic="http://schemas.openxmlformats.org/drawingml/2006/picture">
+                  <pic:nvPicPr>
+                    <pic:cNvPr id="1922328262" name="Image 1" descr="Une image contenant texte, Police, ligne, nombre&#10;&#10;Le contenu généré par l’IA peut être incorrect."/>
+                    <pic:cNvPicPr/>
+                  </pic:nvPicPr>
+                  <pic:blipFill>
+                    <a:blip r:embed="rId28"/>
+                    <a:stretch>
+                      <a:fillRect/>
+                    </a:stretch>
+                  </pic:blipFill>
+                  <pic:spPr>
+                    <a:xfrm>
+                      <a:off x="0" y="0"/>
+                      <a:ext cx="5760720" cy="1186815"/>
+                    </a:xfrm>
+                    <a:prstGeom prst="rect">
+                      <a:avLst/>
+                    </a:prstGeom>
+                  </pic:spPr>
+                </pic:pic>
+              </a:graphicData>
+            </a:graphic>
+          </wp:inline>
+        </w:drawing>
+      </w:r>
+    </w:p>
+    <w:p>
+      <w:pPr>
+        <w:rPr>
+          <w:lang w:val="en-US"/>
+        </w:rPr>
+      </w:pPr>
+      <w:r>
+        <w:rPr>
+          <w:lang w:val="en-US"/>
+        </w:rPr>
+        <w:t>Copy your token (if you olost, you have to remove this one and generate a new one)</w:t>
+      </w:r>
+    </w:p>
+    <w:p>
+      <w:pPr>
+        <w:rPr>
+          <w:lang w:val="en-US"/>
+        </w:rPr>
+      </w:pPr>
+      <w:r>
+        <w:rPr>
+          <w:lang w:val="en-US"/>
+        </w:rPr>
+        <w:t>Go to Jenkins</w:t>
+      </w:r>
+    </w:p>
+    <w:p>
+      <w:pPr>
+        <w:rPr>
+          <w:lang w:val="en-US"/>
+        </w:rPr>
+      </w:pPr>
+      <w:r>
+        <w:rPr>
+          <w:lang w:val="en-US"/>
+        </w:rPr>
+        <w:t>Click to add (in the authentication section of sonarqube servers(Jenkins))</w:t>
+      </w:r>
+    </w:p>
+    <w:p>
+      <w:pPr>
+        <w:rPr>
+          <w:lang w:val="en-US"/>
+        </w:rPr>
+      </w:pPr>
+      <w:r>
+        <w:rPr>
+          <w:lang w:val="en-US"/>
+        </w:rPr>
+        <w:t>Select the type secret text</w:t>
+      </w:r>
+    </w:p>
+    <w:p>
+      <w:pPr>
+        <w:rPr>
+          <w:lang w:val="en-US"/>
+        </w:rPr>
+      </w:pPr>
+      <w:r>
+        <w:rPr>
+          <w:lang w:val="en-US"/>
+        </w:rPr>
+        <w:t>Paste the token in the secret field</w:t>
+      </w:r>
+    </w:p>
+    <w:p>
+      <w:pPr>
+        <w:rPr>
+          <w:lang w:val="en-US"/>
+        </w:rPr>
+      </w:pPr>
+      <w:r>
+        <w:rPr>
+          <w:lang w:val="en-US"/>
+        </w:rPr>
+        <w:t>Give sonartoken as ID and description</w:t>
+      </w:r>
+    </w:p>
+    <w:p>
+      <w:pPr>
+        <w:rPr>
+          <w:lang w:val="en-US"/>
+        </w:rPr>
+      </w:pPr>
+      <w:r>
+        <w:rPr>
+          <w:lang w:val="en-US"/>
+        </w:rPr>
+        <w:t>Click to add</w:t>
+      </w:r>
+    </w:p>
+    <w:p>
+      <w:pPr>
+        <w:rPr>
+          <w:lang w:val="en-US"/>
+        </w:rPr>
+      </w:pPr>
+      <w:r>
+        <w:rPr>
+          <w:lang w:val="en-US"/>
+        </w:rPr>
+        <w:t>Then choose sonarqube in the list</w:t>
+      </w:r>
+    </w:p>
+    <w:p>
+      <w:pPr>
+        <w:rPr>
+          <w:lang w:val="en-US"/>
+        </w:rPr>
+      </w:pPr>
+      <w:r>
+        <w:rPr>
+          <w:noProof/>
+          <w:lang w:val="en-US"/>
+        </w:rPr>
+        <w:drawing>
+          <wp:inline distT="0" distB="0" distL="0" distR="0" wp14:anchorId="42A21F15" wp14:editId="6C981501">
+            <wp:extent cx="5760720" cy="2800985"/>
+            <wp:effectExtent l="0" t="0" r="0" b="0"/>
+            <wp:docPr id="1251620763" name="Image 1" descr="Une image contenant texte, capture d’écran, nombre, ligne&#10;&#10;Le contenu généré par l’IA peut être incorrect."/>
+            <wp:cNvGraphicFramePr>
+              <a:graphicFrameLocks xmlns:a="http://schemas.openxmlformats.org/drawingml/2006/main" noChangeAspect="1"/>
+            </wp:cNvGraphicFramePr>
+            <a:graphic xmlns:a="http://schemas.openxmlformats.org/drawingml/2006/main">
+              <a:graphicData uri="http://schemas.openxmlformats.org/drawingml/2006/picture">
+                <pic:pic xmlns:pic="http://schemas.openxmlformats.org/drawingml/2006/picture">
+                  <pic:nvPicPr>
+                    <pic:cNvPr id="1251620763" name="Image 1" descr="Une image contenant texte, capture d’écran, nombre, ligne&#10;&#10;Le contenu généré par l’IA peut être incorrect."/>
+                    <pic:cNvPicPr/>
+                  </pic:nvPicPr>
+                  <pic:blipFill>
+                    <a:blip r:embed="rId29"/>
+                    <a:stretch>
+                      <a:fillRect/>
+                    </a:stretch>
+                  </pic:blipFill>
+                  <pic:spPr>
+                    <a:xfrm>
+                      <a:off x="0" y="0"/>
+                      <a:ext cx="5760720" cy="2800985"/>
+                    </a:xfrm>
+                    <a:prstGeom prst="rect">
+                      <a:avLst/>
+                    </a:prstGeom>
+                  </pic:spPr>
+                </pic:pic>
+              </a:graphicData>
+            </a:graphic>
+          </wp:inline>
+        </w:drawing>
+      </w:r>
+    </w:p>
+    <w:p>
+      <w:pPr>
+        <w:rPr>
+          <w:lang w:val="en-US"/>
+        </w:rPr>
+      </w:pPr>
+      <w:r>
+        <w:rPr>
+          <w:lang w:val="en-US"/>
+        </w:rPr>
+        <w:t>Be sure to authorize Jenkins to communicate with sonar by adding an inbound rule on sonar security group, with type http</w:t>
+      </w:r>
+      <w:r>
+        <w:rPr>
+          <w:lang w:val="en-US"/>
+        </w:rPr>
+        <w:br/>
+      </w:r>
+      <w:r>
+        <w:rPr>
+          <w:lang w:val="en-US"/>
+        </w:rPr>
+        <w:br/>
+      </w:r>
+    </w:p>
+    <w:p>
+      <w:pPr>
+        <w:rPr>
+          <w:lang w:val="en-US"/>
+        </w:rPr>
+      </w:pPr>
+      <w:r>
+        <w:rPr>
+          <w:lang w:val="en-US"/>
+        </w:rPr>
+        <w:br w:type="page"/>
+      </w:r>
+    </w:p>
+    <w:p>
+      <w:pPr>
+        <w:rPr>
+          <w:lang w:val="en-US"/>
+        </w:rPr>
+      </w:pPr>
+      <w:r>
+        <w:rPr>
+          <w:lang w:val="en-US"/>
+        </w:rPr>
+        <w:lastRenderedPageBreak/>
+        <w:t>In the code of the pipeline we executed before, put the build stage before the unit test stage, then add this new stage</w:t>
+      </w:r>
+    </w:p>
+    <w:p>
+      <w:pPr>
+        <w:rPr>
+          <w:lang w:val="en-US"/>
+        </w:rPr>
+      </w:pPr>
+      <w:r>
+        <w:rPr>
+          <w:lang w:val="en-US"/>
+        </w:rPr>
+        <w:t>sta</w:t>
+      </w:r>
+      <w:r>
+        <w:rPr>
+          <w:lang w:val="en-US"/>
+        </w:rPr>
+        <w:t>ge('Checkstyle Analysis') {</w:t>
+      </w:r>
+      <w:r>
+        <w:rPr>
+          <w:lang w:val="en-US"/>
+        </w:rPr>
+        <w:br/>
+        <w:t xml:space="preserve">   steps {</w:t>
+      </w:r>
+      <w:r>
+        <w:rPr>
+          <w:lang w:val="en-US"/>
+        </w:rPr>
+        <w:br/>
+        <w:t xml:space="preserve">       sh 'mvn checkstyle:checkstyle'</w:t>
+      </w:r>
+      <w:r>
+        <w:rPr>
+          <w:lang w:val="en-US"/>
+        </w:rPr>
+        <w:br/>
+        <w:t xml:space="preserve">   }</w:t>
+      </w:r>
+      <w:r>
+        <w:rPr>
+          <w:lang w:val="en-US"/>
+        </w:rPr>
+        <w:br/>
+        <w:t>}</w:t>
+      </w:r>
+    </w:p>
+    <w:p>
+      <w:pPr>
+        <w:rPr>
+          <w:lang w:val="en-US"/>
+        </w:rPr>
+      </w:pPr>
+      <w:r>
+        <w:rPr>
+          <w:lang w:val="en-US"/>
+        </w:rPr>
+        <w:t>stage('Sonar code Analysis') {</w:t>
+      </w:r>
+      <w:r>
+        <w:rPr>
+          <w:lang w:val="en-US"/>
+        </w:rPr>
+        <w:br/>
+        <w:t xml:space="preserve">   environment {</w:t>
+      </w:r>
+      <w:r>
+        <w:rPr>
+          <w:lang w:val="en-US"/>
+        </w:rPr>
+        <w:br/>
+        <w:t xml:space="preserve">       scannerHome = tool 'Sonar6.2'</w:t>
+      </w:r>
+      <w:r>
+        <w:rPr>
+          <w:lang w:val="en-US"/>
+        </w:rPr>
+        <w:br/>
+        <w:t xml:space="preserve">   }</w:t>
+      </w:r>
+      <w:r>
+        <w:rPr>
+          <w:lang w:val="en-US"/>
+        </w:rPr>
+        <w:br/>
+        <w:t xml:space="preserve">   steps {</w:t>
+      </w:r>
+      <w:r>
+        <w:rPr>
+          <w:lang w:val="en-US"/>
+        </w:rPr>
+        <w:br/>
+        <w:t xml:space="preserve">       withSonarQubeEnv('sonarserver') {</w:t>
+      </w:r>
+      <w:r>
+        <w:rPr>
+          <w:lang w:val="en-US"/>
+        </w:rPr>
+        <w:br/>
+        <w:t xml:space="preserve">           sh '''${scannerHome}/bin/sonar-scanner -Dsonar.projectKey=vprofile \</w:t>
+      </w:r>
+      <w:r>
+        <w:rPr>
+          <w:lang w:val="en-US"/>
+        </w:rPr>
+        <w:br/>
+        <w:t xml:space="preserve">          -Dsonar.projectName=vprofile-repo \</w:t>
+      </w:r>
+      <w:r>
+        <w:rPr>
+          <w:lang w:val="en-US"/>
+        </w:rPr>
+        <w:br/>
+        <w:t xml:space="preserve">          -Dsonar.projectVersion=1.0 \</w:t>
+      </w:r>
+      <w:r>
+        <w:rPr>
+          <w:lang w:val="en-US"/>
+        </w:rPr>
+        <w:br/>
+        <w:t xml:space="preserve">          -Dsonar.sources=src/ \</w:t>
+      </w:r>
+      <w:r>
+        <w:rPr>
+          <w:lang w:val="en-US"/>
+        </w:rPr>
+        <w:br/>
+        <w:t xml:space="preserve">          -Dsonar.java.binaries=target/test-classes/com/visualpathit/account/controllerTest/ \</w:t>
+      </w:r>
+      <w:r>
+        <w:rPr>
+          <w:lang w:val="en-US"/>
+        </w:rPr>
+        <w:br/>
+        <w:t xml:space="preserve">          -Dsonar.junit.reportsPath=target/surefire-reports/ \</w:t>
+      </w:r>
+      <w:r>
+        <w:rPr>
+          <w:lang w:val="en-US"/>
+        </w:rPr>
+        <w:br/>
+        <w:t xml:space="preserve">          -Dsonar.jacoco.reportsPath=target/jacoco.exec \</w:t>
+      </w:r>
+      <w:r>
+        <w:rPr>
+          <w:lang w:val="en-US"/>
+        </w:rPr>
+        <w:br/>
+        <w:t xml:space="preserve">          -Dsonar.java.checkstyle.reportPaths=target/checkstyle-result.xml'''</w:t>
+      </w:r>
+      <w:r>
+        <w:rPr>
+          <w:lang w:val="en-US"/>
+        </w:rPr>
+        <w:br/>
+        <w:t xml:space="preserve">       }</w:t>
+      </w:r>
+      <w:r>
+        <w:rPr>
+          <w:lang w:val="en-US"/>
+        </w:rPr>
+        <w:br/>
+        <w:t xml:space="preserve">   }</w:t>
+      </w:r>
+      <w:r>
+        <w:rPr>
+          <w:lang w:val="en-US"/>
+        </w:rPr>
+        <w:br/>
+        <w:t>}</w:t>
+      </w:r>
+    </w:p>
+    <w:p>
+      <w:pPr>
+        <w:rPr>
+          <w:lang w:val="en-US"/>
+        </w:rPr>
+      </w:pPr>
+      <w:r>
+        <w:rPr>
+          <w:lang w:val="en-US"/>
+        </w:rPr>
+        <w:t>Now, create a new item (pipeline), copy paste this code and run the pipeline</w:t>
+      </w:r>
+      <w:r>
+        <w:rPr>
+          <w:lang w:val="en-US"/>
+        </w:rPr>
+        <w:br/>
+      </w:r>
+      <w:r>
+        <w:rPr>
+          <w:lang w:val="en-US"/>
+        </w:rPr>
+        <w:br/>
+      </w:r>
+    </w:p>
+    <w:p>
+      <w:pPr>
+        <w:rPr>
+          <w:lang w:val="en-US"/>
+        </w:rPr>
+      </w:pPr>
+      <w:r>
+        <w:rPr>
+          <w:lang w:val="en-US"/>
+        </w:rPr>
+        <w:br w:type="page"/>
+      </w:r>
+    </w:p>
+    <w:p>
+      <w:pPr>
+        <w:rPr>
+          <w:lang w:val="en-US"/>
+        </w:rPr>
+      </w:pPr>
+      <w:r>
+        <w:rPr>
+          <w:lang w:val="en-US"/>
+        </w:rPr>
+        <w:lastRenderedPageBreak/>
+        <w:t>Here we go, our pipeline is executed successfully</w:t>
+      </w:r>
+    </w:p>
+    <w:p>
+      <w:pPr>
+        <w:rPr>
+          <w:lang w:val="en-US"/>
+        </w:rPr>
+      </w:pPr>
+      <w:r>
+        <w:rPr>
+          <w:noProof/>
+          <w:lang w:val="en-US"/>
+        </w:rPr>
+        <w:drawing>
+          <wp:inline distT="0" distB="0" distL="0" distR="0" wp14:anchorId="167DE3F9" wp14:editId="08C4D26E">
+            <wp:extent cx="5760720" cy="3085465"/>
+            <wp:effectExtent l="0" t="0" r="0" b="635"/>
+            <wp:docPr id="729867228" name="Image 1" descr="Une image contenant texte, capture d’écran, logiciel, Page web&#10;&#10;Le contenu généré par l’IA peut être incorrect."/>
+            <wp:cNvGraphicFramePr>
+              <a:graphicFrameLocks xmlns:a="http://schemas.openxmlformats.org/drawingml/2006/main" noChangeAspect="1"/>
+            </wp:cNvGraphicFramePr>
+            <a:graphic xmlns:a="http://schemas.openxmlformats.org/drawingml/2006/main">
+              <a:graphicData uri="http://schemas.openxmlformats.org/drawingml/2006/picture">
+                <pic:pic xmlns:pic="http://schemas.openxmlformats.org/drawingml/2006/picture">
+                  <pic:nvPicPr>
+                    <pic:cNvPr id="729867228" name="Image 1" descr="Une image contenant texte, capture d’écran, logiciel, Page web&#10;&#10;Le contenu généré par l’IA peut être incorrect."/>
+                    <pic:cNvPicPr/>
+                  </pic:nvPicPr>
+                  <pic:blipFill>
+                    <a:blip r:embed="rId30"/>
+                    <a:stretch>
+                      <a:fillRect/>
+                    </a:stretch>
+                  </pic:blipFill>
+                  <pic:spPr>
+                    <a:xfrm>
+                      <a:off x="0" y="0"/>
+                      <a:ext cx="5760720" cy="3085465"/>
+                    </a:xfrm>
+                    <a:prstGeom prst="rect">
+                      <a:avLst/>
+                    </a:prstGeom>
+                  </pic:spPr>
+                </pic:pic>
+              </a:graphicData>
+            </a:graphic>
+          </wp:inline>
+        </w:drawing>
+      </w:r>
+    </w:p>
+    <w:p>
+      <w:pPr>
+        <w:rPr>
+          <w:lang w:val="en-US"/>
+        </w:rPr>
+      </w:pPr>
+    </w:p>
+    <w:p>
+      <w:pPr>
+        <w:rPr>
+          <w:lang w:val="en-US"/>
+        </w:rPr>
+      </w:pPr>
+      <w:r>
+        <w:rPr>
+          <w:lang w:val="en-US"/>
+        </w:rPr>
+        <w:t>Go to sonar server and you will have this picture</w:t>
+      </w:r>
+    </w:p>
+    <w:p>
+      <w:pPr>
+        <w:rPr>
+          <w:lang w:val="en-US"/>
+        </w:rPr>
+      </w:pPr>
+      <w:r>
+        <w:rPr>
+          <w:noProof/>
+          <w:lang w:val="en-US"/>
+        </w:rPr>
+        <w:drawing>
+          <wp:inline distT="0" distB="0" distL="0" distR="0" wp14:anchorId="66D12D8D" wp14:editId="5E88036F">
+            <wp:extent cx="5760720" cy="3080385"/>
+            <wp:effectExtent l="0" t="0" r="0" b="5715"/>
+            <wp:docPr id="2096376662" name="Image 1" descr="Une image contenant texte, logiciel, Icône d’ordinateur, Page web&#10;&#10;Le contenu généré par l’IA peut être incorrect."/>
+            <wp:cNvGraphicFramePr>
+              <a:graphicFrameLocks xmlns:a="http://schemas.openxmlformats.org/drawingml/2006/main" noChangeAspect="1"/>
+            </wp:cNvGraphicFramePr>
+            <a:graphic xmlns:a="http://schemas.openxmlformats.org/drawingml/2006/main">
+              <a:graphicData uri="http://schemas.openxmlformats.org/drawingml/2006/picture">
+                <pic:pic xmlns:pic="http://schemas.openxmlformats.org/drawingml/2006/picture">
+                  <pic:nvPicPr>
+                    <pic:cNvPr id="2096376662" name="Image 1" descr="Une image contenant texte, logiciel, Icône d’ordinateur, Page web&#10;&#10;Le contenu généré par l’IA peut être incorrect."/>
+                    <pic:cNvPicPr/>
+                  </pic:nvPicPr>
+                  <pic:blipFill>
+                    <a:blip r:embed="rId31"/>
+                    <a:stretch>
+                      <a:fillRect/>
+                    </a:stretch>
+                  </pic:blipFill>
+                  <pic:spPr>
+                    <a:xfrm>
+                      <a:off x="0" y="0"/>
+                      <a:ext cx="5760720" cy="3080385"/>
+                    </a:xfrm>
+                    <a:prstGeom prst="rect">
+                      <a:avLst/>
+                    </a:prstGeom>
+                  </pic:spPr>
+                </pic:pic>
+              </a:graphicData>
+            </a:graphic>
+          </wp:inline>
+        </w:drawing>
+      </w:r>
+    </w:p>
+    <w:p>
+      <w:pPr>
+        <w:rPr>
+          <w:lang w:val="en-US"/>
+        </w:rPr>
+      </w:pPr>
+      <w:r>
+        <w:rPr>
+          <w:noProof/>
+          <w:lang w:val="en-US"/>
+        </w:rPr>
+        <w:lastRenderedPageBreak/>
+        <w:drawing>
+          <wp:inline distT="0" distB="0" distL="0" distR="0" wp14:anchorId="11646A03" wp14:editId="6DF6F5A6">
+            <wp:extent cx="5760720" cy="3137535"/>
+            <wp:effectExtent l="0" t="0" r="0" b="5715"/>
+            <wp:docPr id="1067554218" name="Image 1" descr="Une image contenant texte, capture d’écran, logiciel, Icône d’ordinateur&#10;&#10;Le contenu généré par l’IA peut être incorrect."/>
+            <wp:cNvGraphicFramePr>
+              <a:graphicFrameLocks xmlns:a="http://schemas.openxmlformats.org/drawingml/2006/main" noChangeAspect="1"/>
+            </wp:cNvGraphicFramePr>
+            <a:graphic xmlns:a="http://schemas.openxmlformats.org/drawingml/2006/main">
+              <a:graphicData uri="http://schemas.openxmlformats.org/drawingml/2006/picture">
+                <pic:pic xmlns:pic="http://schemas.openxmlformats.org/drawingml/2006/picture">
+                  <pic:nvPicPr>
+                    <pic:cNvPr id="1067554218" name="Image 1" descr="Une image contenant texte, capture d’écran, logiciel, Icône d’ordinateur&#10;&#10;Le contenu généré par l’IA peut être incorrect."/>
+                    <pic:cNvPicPr/>
+                  </pic:nvPicPr>
+                  <pic:blipFill>
+                    <a:blip r:embed="rId32"/>
+                    <a:stretch>
+                      <a:fillRect/>
+                    </a:stretch>
+                  </pic:blipFill>
+                  <pic:spPr>
+                    <a:xfrm>
+                      <a:off x="0" y="0"/>
+                      <a:ext cx="5760720" cy="3137535"/>
+                    </a:xfrm>
+                    <a:prstGeom prst="rect">
+                      <a:avLst/>
+                    </a:prstGeom>
+                  </pic:spPr>
+                </pic:pic>
+              </a:graphicData>
+            </a:graphic>
+          </wp:inline>
+        </w:drawing>
+      </w:r>
+    </w:p>
+    <w:p>
+      <w:pPr>
+        <w:rPr>
+          <w:lang w:val="en-US"/>
+        </w:rPr>
+      </w:pPr>
+    </w:p>
+    <w:p>
+      <w:pPr>
+        <w:rPr>
+          <w:lang w:val="en-US"/>
+        </w:rPr>
+      </w:pPr>
+      <w:r>
+        <w:rPr>
+          <w:lang w:val="en-US"/>
+        </w:rPr>
+        <w:t>Everything is good and the pipeline passed, this is the default quality gate. In the next step, we will define Quality Gate to determine when the analysis will be a success or not</w:t>
+      </w:r>
+      <w:r>
+        <w:rPr>
+          <w:lang w:val="en-US"/>
+        </w:rPr>
+        <w:t>.</w:t>
+      </w:r>
+    </w:p>
+    <w:p>
+      <w:pPr>
+        <w:rPr>
+          <w:lang w:val="en-US"/>
+        </w:rPr>
+      </w:pPr>
+      <w:r>
+        <w:rPr>
+          <w:lang w:val="en-US"/>
+        </w:rPr>
+        <w:t xml:space="preserve">To define a quality gate, </w:t>
+      </w:r>
+    </w:p>
+    <w:p>
+      <w:pPr>
+        <w:rPr>
+          <w:lang w:val="en-US"/>
+        </w:rPr>
+      </w:pPr>
+      <w:r>
+        <w:rPr>
+          <w:lang w:val="en-US"/>
+        </w:rPr>
+        <w:t>Go to SonarQube dashboard</w:t>
+      </w:r>
+    </w:p>
+    <w:p>
+      <w:pPr>
+        <w:rPr>
+          <w:lang w:val="en-US"/>
+        </w:rPr>
+      </w:pPr>
+      <w:r>
+        <w:rPr>
+          <w:lang w:val="en-US"/>
+        </w:rPr>
+        <w:t>Go to quality gate section</w:t>
+      </w:r>
+    </w:p>
+    <w:p>
+      <w:pPr>
+        <w:rPr>
+          <w:lang w:val="en-US"/>
+        </w:rPr>
+      </w:pPr>
+      <w:r>
+        <w:rPr>
+          <w:lang w:val="en-US"/>
+        </w:rPr>
+        <w:t>Click to create button</w:t>
+      </w:r>
+    </w:p>
+    <w:p>
+      <w:pPr>
+        <w:rPr>
+          <w:lang w:val="en-US"/>
+        </w:rPr>
+      </w:pPr>
+      <w:r>
+        <w:rPr>
+          <w:lang w:val="en-US"/>
+        </w:rPr>
+        <w:t>Give a name : Jenkins-QG</w:t>
+      </w:r>
+    </w:p>
+    <w:p>
+      <w:pPr>
+        <w:rPr>
+          <w:lang w:val="en-US"/>
+        </w:rPr>
+      </w:pPr>
+      <w:r>
+        <w:rPr>
+          <w:lang w:val="en-US"/>
+        </w:rPr>
+        <w:t>Save to create the quality gate</w:t>
+      </w:r>
+    </w:p>
+    <w:p>
+      <w:pPr>
+        <w:rPr>
+          <w:lang w:val="en-US"/>
+        </w:rPr>
+      </w:pPr>
+      <w:r>
+        <w:rPr>
+          <w:lang w:val="en-US"/>
+        </w:rPr>
+        <w:t>Scroll Down</w:t>
+      </w:r>
+    </w:p>
+    <w:p>
+      <w:pPr>
+        <w:rPr>
+          <w:lang w:val="en-US"/>
+        </w:rPr>
+      </w:pPr>
+      <w:r>
+        <w:rPr>
+          <w:lang w:val="en-US"/>
+        </w:rPr>
+        <w:t>Click to Unlock editing</w:t>
+      </w:r>
+    </w:p>
+    <w:p>
+      <w:pPr>
+        <w:rPr>
+          <w:lang w:val="en-US"/>
+        </w:rPr>
+      </w:pPr>
+      <w:r>
+        <w:rPr>
+          <w:lang w:val="en-US"/>
+        </w:rPr>
+        <w:t>Click to Add Condition</w:t>
+      </w:r>
+    </w:p>
+    <w:p>
+      <w:pPr>
+        <w:rPr>
+          <w:lang w:val="en-US"/>
+        </w:rPr>
+      </w:pPr>
+      <w:r>
+        <w:rPr>
+          <w:lang w:val="en-US"/>
+        </w:rPr>
+        <w:t>Choose On Overall Code</w:t>
+      </w:r>
+    </w:p>
+    <w:p>
+      <w:pPr>
+        <w:rPr>
+          <w:lang w:val="en-US"/>
+        </w:rPr>
+      </w:pPr>
+      <w:r>
+        <w:rPr>
+          <w:lang w:val="en-US"/>
+        </w:rPr>
+        <w:t>In Quality Gate fails when, you have lots off condition, in this exercise, I choosed Bugs</w:t>
+      </w:r>
+    </w:p>
+    <w:p>
+      <w:pPr>
+        <w:rPr>
+          <w:lang w:val="en-US"/>
+        </w:rPr>
+      </w:pPr>
+      <w:r>
+        <w:rPr>
+          <w:lang w:val="en-US"/>
+        </w:rPr>
+        <w:t>Give 10 as Value (There are 30 bugs, so this time, the result will not pass)</w:t>
+      </w:r>
+    </w:p>
+    <w:p>
+      <w:pPr>
+        <w:rPr>
+          <w:lang w:val="en-US"/>
+        </w:rPr>
+      </w:pPr>
+      <w:r>
+        <w:rPr>
+          <w:noProof/>
+          <w:lang w:val="en-US"/>
+        </w:rPr>
+        <w:lastRenderedPageBreak/>
+        <w:drawing>
+          <wp:inline distT="0" distB="0" distL="0" distR="0" wp14:anchorId="6B85D4A0" wp14:editId="51E9D066">
+            <wp:extent cx="5760720" cy="6001385"/>
+            <wp:effectExtent l="0" t="0" r="0" b="0"/>
+            <wp:docPr id="922168067" name="Image 1" descr="Une image contenant texte, Appareils électroniques, capture d’écran, logiciel&#10;&#10;Le contenu généré par l’IA peut être incorrect."/>
+            <wp:cNvGraphicFramePr>
+              <a:graphicFrameLocks xmlns:a="http://schemas.openxmlformats.org/drawingml/2006/main" noChangeAspect="1"/>
+            </wp:cNvGraphicFramePr>
+            <a:graphic xmlns:a="http://schemas.openxmlformats.org/drawingml/2006/main">
+              <a:graphicData uri="http://schemas.openxmlformats.org/drawingml/2006/picture">
+                <pic:pic xmlns:pic="http://schemas.openxmlformats.org/drawingml/2006/picture">
+                  <pic:nvPicPr>
+                    <pic:cNvPr id="922168067" name="Image 1" descr="Une image contenant texte, Appareils électroniques, capture d’écran, logiciel&#10;&#10;Le contenu généré par l’IA peut être incorrect."/>
+                    <pic:cNvPicPr/>
+                  </pic:nvPicPr>
+                  <pic:blipFill>
+                    <a:blip r:embed="rId33"/>
+                    <a:stretch>
+                      <a:fillRect/>
+                    </a:stretch>
+                  </pic:blipFill>
+                  <pic:spPr>
+                    <a:xfrm>
+                      <a:off x="0" y="0"/>
+                      <a:ext cx="5760720" cy="6001385"/>
+                    </a:xfrm>
+                    <a:prstGeom prst="rect">
+                      <a:avLst/>
+                    </a:prstGeom>
+                  </pic:spPr>
+                </pic:pic>
+              </a:graphicData>
+            </a:graphic>
+          </wp:inline>
+        </w:drawing>
+      </w:r>
+    </w:p>
+    <w:p>
+      <w:pPr>
+        <w:rPr>
+          <w:lang w:val="en-US"/>
+        </w:rPr>
+      </w:pPr>
+      <w:r>
+        <w:rPr>
+          <w:lang w:val="en-US"/>
+        </w:rPr>
+        <w:t>After that</w:t>
+      </w:r>
+    </w:p>
+    <w:p>
+      <w:pPr>
+        <w:rPr>
+          <w:lang w:val="en-US"/>
+        </w:rPr>
+      </w:pPr>
+      <w:r>
+        <w:rPr>
+          <w:lang w:val="en-US"/>
+        </w:rPr>
+        <w:t>Go to Projects Section</w:t>
+      </w:r>
+    </w:p>
+    <w:p>
+      <w:pPr>
+        <w:rPr>
+          <w:lang w:val="en-US"/>
+        </w:rPr>
+      </w:pPr>
+      <w:r>
+        <w:rPr>
+          <w:lang w:val="en-US"/>
+        </w:rPr>
+        <w:t>Choose our project (vprofile-repo)</w:t>
+      </w:r>
+    </w:p>
+    <w:p>
+      <w:pPr>
+        <w:rPr>
+          <w:lang w:val="en-US"/>
+        </w:rPr>
+      </w:pPr>
+      <w:r>
+        <w:rPr>
+          <w:lang w:val="en-US"/>
+        </w:rPr>
+        <w:t>Click to project settings</w:t>
+      </w:r>
+    </w:p>
+    <w:p>
+      <w:pPr>
+        <w:rPr>
+          <w:lang w:val="en-US"/>
+        </w:rPr>
+      </w:pPr>
+      <w:r>
+        <w:rPr>
+          <w:lang w:val="en-US"/>
+        </w:rPr>
+        <w:t>Click to quality gate</w:t>
+      </w:r>
+    </w:p>
+    <w:p>
+      <w:pPr>
+        <w:rPr>
+          <w:lang w:val="en-US"/>
+        </w:rPr>
+      </w:pPr>
+      <w:r>
+        <w:rPr>
+          <w:noProof/>
+          <w:lang w:val="en-US"/>
+        </w:rPr>
+        <w:lastRenderedPageBreak/>
+        <w:drawing>
+          <wp:inline distT="0" distB="0" distL="0" distR="0" wp14:anchorId="6FB3A782" wp14:editId="42065A51">
+            <wp:extent cx="5760720" cy="2208530"/>
+            <wp:effectExtent l="0" t="0" r="0" b="1270"/>
+            <wp:docPr id="680088874" name="Image 1" descr="Une image contenant texte, logiciel, Icône d’ordinateur, Page web&#10;&#10;Le contenu généré par l’IA peut être incorrect."/>
+            <wp:cNvGraphicFramePr>
+              <a:graphicFrameLocks xmlns:a="http://schemas.openxmlformats.org/drawingml/2006/main" noChangeAspect="1"/>
+            </wp:cNvGraphicFramePr>
+            <a:graphic xmlns:a="http://schemas.openxmlformats.org/drawingml/2006/main">
+              <a:graphicData uri="http://schemas.openxmlformats.org/drawingml/2006/picture">
+                <pic:pic xmlns:pic="http://schemas.openxmlformats.org/drawingml/2006/picture">
+                  <pic:nvPicPr>
+                    <pic:cNvPr id="680088874" name="Image 1" descr="Une image contenant texte, logiciel, Icône d’ordinateur, Page web&#10;&#10;Le contenu généré par l’IA peut être incorrect."/>
+                    <pic:cNvPicPr/>
+                  </pic:nvPicPr>
+                  <pic:blipFill>
+                    <a:blip r:embed="rId34"/>
+                    <a:stretch>
+                      <a:fillRect/>
+                    </a:stretch>
+                  </pic:blipFill>
+                  <pic:spPr>
+                    <a:xfrm>
+                      <a:off x="0" y="0"/>
+                      <a:ext cx="5760720" cy="2208530"/>
+                    </a:xfrm>
+                    <a:prstGeom prst="rect">
+                      <a:avLst/>
+                    </a:prstGeom>
+                  </pic:spPr>
+                </pic:pic>
+              </a:graphicData>
+            </a:graphic>
+          </wp:inline>
+        </w:drawing>
+      </w:r>
+    </w:p>
+    <w:p>
+      <w:pPr>
+        <w:rPr>
+          <w:lang w:val="en-US"/>
+        </w:rPr>
+      </w:pPr>
+      <w:r>
+        <w:rPr>
+          <w:lang w:val="en-US"/>
+        </w:rPr>
+        <w:t>Choose Always use a specific quality gate</w:t>
+      </w:r>
+    </w:p>
+    <w:p>
+      <w:pPr>
+        <w:rPr>
+          <w:lang w:val="en-US"/>
+        </w:rPr>
+      </w:pPr>
+      <w:r>
+        <w:rPr>
+          <w:lang w:val="en-US"/>
+        </w:rPr>
+        <w:t>Select Jenkins-QG</w:t>
+      </w:r>
+    </w:p>
+    <w:p>
+      <w:pPr>
+        <w:rPr>
+          <w:lang w:val="en-US"/>
+        </w:rPr>
+      </w:pPr>
+      <w:r>
+        <w:rPr>
+          <w:lang w:val="en-US"/>
+        </w:rPr>
+        <w:t>Then Save</w:t>
+      </w:r>
+    </w:p>
+    <w:p>
+      <w:pPr>
+        <w:rPr>
+          <w:lang w:val="en-US"/>
+        </w:rPr>
+      </w:pPr>
+      <w:r>
+        <w:rPr>
+          <w:noProof/>
+          <w:lang w:val="en-US"/>
+        </w:rPr>
+        <w:drawing>
+          <wp:inline distT="0" distB="0" distL="0" distR="0" wp14:anchorId="5A603640" wp14:editId="69FC7985">
+            <wp:extent cx="5760720" cy="2720340"/>
+            <wp:effectExtent l="0" t="0" r="0" b="3810"/>
+            <wp:docPr id="1226833384" name="Image 1" descr="Une image contenant texte, capture d’écran, logiciel, Page web&#10;&#10;Le contenu généré par l’IA peut être incorrect."/>
+            <wp:cNvGraphicFramePr>
+              <a:graphicFrameLocks xmlns:a="http://schemas.openxmlformats.org/drawingml/2006/main" noChangeAspect="1"/>
+            </wp:cNvGraphicFramePr>
+            <a:graphic xmlns:a="http://schemas.openxmlformats.org/drawingml/2006/main">
+              <a:graphicData uri="http://schemas.openxmlformats.org/drawingml/2006/picture">
+                <pic:pic xmlns:pic="http://schemas.openxmlformats.org/drawingml/2006/picture">
+                  <pic:nvPicPr>
+                    <pic:cNvPr id="1226833384" name="Image 1" descr="Une image contenant texte, capture d’écran, logiciel, Page web&#10;&#10;Le contenu généré par l’IA peut être incorrect."/>
+                    <pic:cNvPicPr/>
+                  </pic:nvPicPr>
+                  <pic:blipFill>
+                    <a:blip r:embed="rId35"/>
+                    <a:stretch>
+                      <a:fillRect/>
+                    </a:stretch>
+                  </pic:blipFill>
+                  <pic:spPr>
+                    <a:xfrm>
+                      <a:off x="0" y="0"/>
+                      <a:ext cx="5760720" cy="2720340"/>
+                    </a:xfrm>
+                    <a:prstGeom prst="rect">
+                      <a:avLst/>
+                    </a:prstGeom>
+                  </pic:spPr>
+                </pic:pic>
+              </a:graphicData>
+            </a:graphic>
+          </wp:inline>
+        </w:drawing>
+      </w:r>
+    </w:p>
+    <w:p>
+      <w:pPr>
+        <w:rPr>
+          <w:lang w:val="en-US"/>
+        </w:rPr>
+      </w:pPr>
+    </w:p>
+    <w:p>
+      <w:pPr>
+        <w:rPr>
+          <w:lang w:val="en-US"/>
+        </w:rPr>
+      </w:pPr>
+      <w:r>
+        <w:rPr>
+          <w:lang w:val="en-US"/>
+        </w:rPr>
+        <w:t>Once the quality gate is checked, sonarqube will sent the result to Jenkins</w:t>
+      </w:r>
+      <w:r>
+        <w:rPr>
+          <w:lang w:val="en-US"/>
+        </w:rPr>
+        <w:t xml:space="preserve">. So we need to create a webhook. Still on Sonarqube, </w:t>
+      </w:r>
+    </w:p>
+    <w:p>
+      <w:pPr>
+        <w:rPr>
+          <w:lang w:val="en-US"/>
+        </w:rPr>
+      </w:pPr>
+      <w:r>
+        <w:rPr>
+          <w:lang w:val="en-US"/>
+        </w:rPr>
+        <w:t xml:space="preserve">choose the project, </w:t>
+      </w:r>
+    </w:p>
+    <w:p>
+      <w:pPr>
+        <w:rPr>
+          <w:lang w:val="en-US"/>
+        </w:rPr>
+      </w:pPr>
+      <w:r>
+        <w:rPr>
+          <w:lang w:val="en-US"/>
+        </w:rPr>
+        <w:t>click to project settingsc</w:t>
+      </w:r>
+    </w:p>
+    <w:p>
+      <w:pPr>
+        <w:rPr>
+          <w:lang w:val="en-US"/>
+        </w:rPr>
+      </w:pPr>
+      <w:r>
+        <w:rPr>
+          <w:lang w:val="en-US"/>
+        </w:rPr>
+        <w:t>lick to webhook to create one</w:t>
+      </w:r>
+    </w:p>
+    <w:p>
+      <w:pPr>
+        <w:rPr>
+          <w:lang w:val="en-US"/>
+        </w:rPr>
+      </w:pPr>
+      <w:r>
+        <w:rPr>
+          <w:lang w:val="en-US"/>
+        </w:rPr>
+        <w:t xml:space="preserve">Click to create </w:t>
+      </w:r>
+    </w:p>
+    <w:p>
+      <w:pPr>
+        <w:rPr>
+          <w:lang w:val="en-US"/>
+        </w:rPr>
+      </w:pPr>
+      <w:r>
+        <w:rPr>
+          <w:lang w:val="en-US"/>
+        </w:rPr>
+        <w:t>Give the name : Jenkins-CI-WebHook</w:t>
+      </w:r>
+    </w:p>
+    <w:p>
+      <w:pPr>
+        <w:rPr>
+          <w:lang w:val="en-US"/>
+        </w:rPr>
+      </w:pPr>
+      <w:r>
+        <w:rPr>
+          <w:lang w:val="en-US"/>
+        </w:rPr>
+        <w:t xml:space="preserve">The url will be </w:t>
+      </w:r>
+      <w:hyperlink r:id="rId36" w:history="1">
+        <w:r>
+          <w:rPr>
+            <w:rStyle w:val="Lienhypertexte"/>
+            <w:lang w:val="en-US"/>
+          </w:rPr>
+          <w:t>http://private-ip-of-jenkins:8080/sonarqube-webhook</w:t>
+        </w:r>
+      </w:hyperlink>
+    </w:p>
+    <w:p>
+      <w:pPr>
+        <w:rPr>
+          <w:lang w:val="en-US"/>
+        </w:rPr>
+      </w:pPr>
+      <w:r>
+        <w:rPr>
+          <w:lang w:val="en-US"/>
+        </w:rPr>
+        <w:lastRenderedPageBreak/>
+        <w:t>Click on create</w:t>
+      </w:r>
+    </w:p>
+    <w:p>
+      <w:pPr>
+        <w:rPr>
+          <w:lang w:val="en-US"/>
+        </w:rPr>
+      </w:pPr>
+      <w:r>
+        <w:rPr>
+          <w:noProof/>
+          <w:lang w:val="en-US"/>
+        </w:rPr>
+        <w:drawing>
+          <wp:inline distT="0" distB="0" distL="0" distR="0" wp14:anchorId="2ACCEA76" wp14:editId="74D06D8C">
+            <wp:extent cx="5268060" cy="6430272"/>
+            <wp:effectExtent l="0" t="0" r="8890" b="8890"/>
+            <wp:docPr id="988094734" name="Image 1" descr="Une image contenant texte, capture d’écran, Police, nombre&#10;&#10;Le contenu généré par l’IA peut être incorrect."/>
+            <wp:cNvGraphicFramePr>
+              <a:graphicFrameLocks xmlns:a="http://schemas.openxmlformats.org/drawingml/2006/main" noChangeAspect="1"/>
+            </wp:cNvGraphicFramePr>
+            <a:graphic xmlns:a="http://schemas.openxmlformats.org/drawingml/2006/main">
+              <a:graphicData uri="http://schemas.openxmlformats.org/drawingml/2006/picture">
+                <pic:pic xmlns:pic="http://schemas.openxmlformats.org/drawingml/2006/picture">
+                  <pic:nvPicPr>
+                    <pic:cNvPr id="988094734" name="Image 1" descr="Une image contenant texte, capture d’écran, Police, nombre&#10;&#10;Le contenu généré par l’IA peut être incorrect."/>
+                    <pic:cNvPicPr/>
+                  </pic:nvPicPr>
+                  <pic:blipFill>
+                    <a:blip r:embed="rId37"/>
+                    <a:stretch>
+                      <a:fillRect/>
+                    </a:stretch>
+                  </pic:blipFill>
+                  <pic:spPr>
+                    <a:xfrm>
+                      <a:off x="0" y="0"/>
+                      <a:ext cx="5268060" cy="6430272"/>
+                    </a:xfrm>
+                    <a:prstGeom prst="rect">
+                      <a:avLst/>
+                    </a:prstGeom>
+                  </pic:spPr>
+                </pic:pic>
+              </a:graphicData>
+            </a:graphic>
+          </wp:inline>
+        </w:drawing>
+      </w:r>
+    </w:p>
+    <w:p>
+      <w:pPr>
+        <w:rPr>
+          <w:lang w:val="en-US"/>
+        </w:rPr>
+      </w:pPr>
+      <w:r>
+        <w:rPr>
+          <w:lang w:val="en-US"/>
+        </w:rPr>
+        <w:t>Add this stage on the pipeline</w:t>
+      </w:r>
+    </w:p>
+    <w:p>
+      <w:pPr>
+        <w:rPr>
+          <w:lang w:val="en-US"/>
+        </w:rPr>
+      </w:pPr>
+      <w:r>
+        <w:rPr>
+          <w:lang w:val="en-US"/>
+        </w:rPr>
+        <w:t>stage("Quality Gate") {</w:t>
+      </w:r>
+    </w:p>
+    <w:p>
+      <w:pPr>
+        <w:rPr>
+          <w:lang w:val="en-US"/>
+        </w:rPr>
+      </w:pPr>
+      <w:r>
+        <w:rPr>
+          <w:lang w:val="en-US"/>
+        </w:rPr>
+        <w:t xml:space="preserve">            steps {</w:t>
+      </w:r>
+    </w:p>
+    <w:p>
+      <w:pPr>
+        <w:rPr>
+          <w:lang w:val="en-US"/>
+        </w:rPr>
+      </w:pPr>
+      <w:r>
+        <w:rPr>
+          <w:lang w:val="en-US"/>
+        </w:rPr>
+        <w:t xml:space="preserve">              timeout(time: 1, unit: 'HOURS') {</w:t>
+      </w:r>
+    </w:p>
+    <w:p>
+      <w:pPr>
+        <w:rPr>
+          <w:lang w:val="en-US"/>
+        </w:rPr>
+      </w:pPr>
+      <w:r>
+        <w:rPr>
+          <w:lang w:val="en-US"/>
+        </w:rPr>
+        <w:t xml:space="preserve">                waitForQualityGate abortPipeline: true</w:t>
+      </w:r>
+    </w:p>
+    <w:p>
+      <w:pPr>
+        <w:rPr>
+          <w:lang w:val="en-US"/>
+        </w:rPr>
+      </w:pPr>
+      <w:r>
+        <w:rPr>
+          <w:lang w:val="en-US"/>
+        </w:rPr>
+        <w:t xml:space="preserve">              }</w:t>
+      </w:r>
+    </w:p>
+    <w:p>
+      <w:pPr>
+        <w:rPr>
+          <w:lang w:val="en-US"/>
+        </w:rPr>
+      </w:pPr>
+      <w:r>
+        <w:rPr>
+          <w:lang w:val="en-US"/>
+        </w:rPr>
+        <w:lastRenderedPageBreak/>
+        <w:t xml:space="preserve">            }</w:t>
+      </w:r>
+    </w:p>
+    <w:p>
+      <w:pPr>
+        <w:rPr>
+          <w:lang w:val="en-US"/>
+        </w:rPr>
+      </w:pPr>
+      <w:r>
+        <w:rPr>
+          <w:lang w:val="en-US"/>
+        </w:rPr>
+        <w:t xml:space="preserve">          }</w:t>
+      </w:r>
+    </w:p>
+    <w:p>
+      <w:pPr>
+        <w:rPr>
+          <w:lang w:val="en-US"/>
+        </w:rPr>
+      </w:pPr>
+      <w:r>
+        <w:rPr>
+          <w:lang w:val="en-US"/>
+        </w:rPr>
+        <w:t>Update our pipeline code on jenkins to</w:t>
+      </w:r>
+      <w:r>
+        <w:rPr>
+          <w:lang w:val="en-US"/>
+        </w:rPr>
+        <w:t xml:space="preserve"> adding this stage below, to do that</w:t>
+      </w:r>
+    </w:p>
+    <w:p>
+      <w:pPr>
+        <w:rPr>
+          <w:lang w:val="en-US"/>
+        </w:rPr>
+      </w:pPr>
+      <w:r>
+        <w:rPr>
+          <w:lang w:val="en-US"/>
+        </w:rPr>
+        <w:t>Go to the dashboard of Jenkins</w:t>
+      </w:r>
+    </w:p>
+    <w:p>
+      <w:pPr>
+        <w:rPr>
+          <w:lang w:val="en-US"/>
+        </w:rPr>
+      </w:pPr>
+      <w:r>
+        <w:rPr>
+          <w:lang w:val="en-US"/>
+        </w:rPr>
+        <w:t>Click to the Analysis Code Pipeline</w:t>
+      </w:r>
+    </w:p>
+    <w:p>
+      <w:pPr>
+        <w:rPr>
+          <w:lang w:val="en-US"/>
+        </w:rPr>
+      </w:pPr>
+      <w:r>
+        <w:rPr>
+          <w:lang w:val="en-US"/>
+        </w:rPr>
+        <w:t>Click to configure</w:t>
+      </w:r>
+    </w:p>
+    <w:p>
+      <w:pPr>
+        <w:rPr>
+          <w:lang w:val="en-US"/>
+        </w:rPr>
+      </w:pPr>
+      <w:r>
+        <w:rPr>
+          <w:lang w:val="en-US"/>
+        </w:rPr>
+        <w:t>Scroll down, put the code at the end of the Sonar code analysis stage</w:t>
+      </w:r>
+    </w:p>
+    <w:p>
+      <w:pPr>
+        <w:rPr>
+          <w:lang w:val="en-US"/>
+        </w:rPr>
+      </w:pPr>
+      <w:r>
+        <w:rPr>
+          <w:lang w:val="en-US"/>
+        </w:rPr>
+        <w:t>Save and Run the build</w:t>
+      </w:r>
+    </w:p>
+    <w:p>
+      <w:pPr>
+        <w:rPr>
+          <w:lang w:val="en-US"/>
+        </w:rPr>
+      </w:pPr>
+      <w:r>
+        <w:rPr>
+          <w:lang w:val="en-US"/>
+        </w:rPr>
+        <w:t>Now, the pipeline will fail because there are more than 10 Bugs, SonarQube Analysis will not pass, so the last stage of the pipeline will fail</w:t>
+      </w:r>
+    </w:p>
+    <w:p>
+      <w:pPr>
+        <w:rPr>
+          <w:lang w:val="en-US"/>
+        </w:rPr>
+      </w:pPr>
+      <w:r>
+        <w:rPr>
+          <w:noProof/>
+          <w:lang w:val="en-US"/>
+        </w:rPr>
+        <w:drawing>
+          <wp:inline distT="0" distB="0" distL="0" distR="0" wp14:anchorId="5A2A3864" wp14:editId="69E762F5">
+            <wp:extent cx="5760720" cy="1479550"/>
+            <wp:effectExtent l="0" t="0" r="0" b="6350"/>
+            <wp:docPr id="1641398528" name="Image 1" descr="Une image contenant capture d’écran, texte, logiciel, Icône d’ordinateur&#10;&#10;Le contenu généré par l’IA peut être incorrect."/>
+            <wp:cNvGraphicFramePr>
+              <a:graphicFrameLocks xmlns:a="http://schemas.openxmlformats.org/drawingml/2006/main" noChangeAspect="1"/>
+            </wp:cNvGraphicFramePr>
+            <a:graphic xmlns:a="http://schemas.openxmlformats.org/drawingml/2006/main">
+              <a:graphicData uri="http://schemas.openxmlformats.org/drawingml/2006/picture">
+                <pic:pic xmlns:pic="http://schemas.openxmlformats.org/drawingml/2006/picture">
+                  <pic:nvPicPr>
+                    <pic:cNvPr id="1641398528" name="Image 1" descr="Une image contenant capture d’écran, texte, logiciel, Icône d’ordinateur&#10;&#10;Le contenu généré par l’IA peut être incorrect."/>
+                    <pic:cNvPicPr/>
+                  </pic:nvPicPr>
+                  <pic:blipFill>
+                    <a:blip r:embed="rId38"/>
+                    <a:stretch>
+                      <a:fillRect/>
+                    </a:stretch>
+                  </pic:blipFill>
+                  <pic:spPr>
+                    <a:xfrm>
+                      <a:off x="0" y="0"/>
+                      <a:ext cx="5760720" cy="1479550"/>
+                    </a:xfrm>
+                    <a:prstGeom prst="rect">
+                      <a:avLst/>
+                    </a:prstGeom>
+                  </pic:spPr>
+                </pic:pic>
+              </a:graphicData>
+            </a:graphic>
+          </wp:inline>
+        </w:drawing>
+      </w:r>
+    </w:p>
+    <w:p>
+      <w:pPr>
+        <w:rPr>
+          <w:lang w:val="en-US"/>
+        </w:rPr>
+      </w:pPr>
+      <w:r>
+        <w:rPr>
+          <w:noProof/>
+          <w:lang w:val="en-US"/>
+        </w:rPr>
+        <w:drawing>
+          <wp:inline distT="0" distB="0" distL="0" distR="0" wp14:anchorId="16C6C1C7" wp14:editId="7F91735B">
+            <wp:extent cx="5760720" cy="3120390"/>
+            <wp:effectExtent l="0" t="0" r="0" b="3810"/>
+            <wp:docPr id="1669315870" name="Image 1" descr="Une image contenant texte, capture d’écran, logiciel, Icône d’ordinateur&#10;&#10;Le contenu généré par l’IA peut être incorrect."/>
+            <wp:cNvGraphicFramePr>
+              <a:graphicFrameLocks xmlns:a="http://schemas.openxmlformats.org/drawingml/2006/main" noChangeAspect="1"/>
+            </wp:cNvGraphicFramePr>
+            <a:graphic xmlns:a="http://schemas.openxmlformats.org/drawingml/2006/main">
+              <a:graphicData uri="http://schemas.openxmlformats.org/drawingml/2006/picture">
+                <pic:pic xmlns:pic="http://schemas.openxmlformats.org/drawingml/2006/picture">
+                  <pic:nvPicPr>
+                    <pic:cNvPr id="1669315870" name="Image 1" descr="Une image contenant texte, capture d’écran, logiciel, Icône d’ordinateur&#10;&#10;Le contenu généré par l’IA peut être incorrect."/>
+                    <pic:cNvPicPr/>
+                  </pic:nvPicPr>
+                  <pic:blipFill>
+                    <a:blip r:embed="rId39"/>
+                    <a:stretch>
+                      <a:fillRect/>
+                    </a:stretch>
+                  </pic:blipFill>
+                  <pic:spPr>
+                    <a:xfrm>
+                      <a:off x="0" y="0"/>
+                      <a:ext cx="5760720" cy="3120390"/>
+                    </a:xfrm>
+                    <a:prstGeom prst="rect">
+                      <a:avLst/>
+                    </a:prstGeom>
+                  </pic:spPr>
+                </pic:pic>
+              </a:graphicData>
+            </a:graphic>
+          </wp:inline>
+        </w:drawing>
+      </w:r>
+    </w:p>
+    <w:p>
+      <w:pPr>
+        <w:rPr>
+          <w:lang w:val="en-US"/>
+        </w:rPr>
+      </w:pPr>
+    </w:p>
+    <w:p>
+      <w:pPr>
+        <w:rPr>
+          <w:lang w:val="en-US"/>
+        </w:rPr>
+      </w:pPr>
+      <w:r>
+        <w:rPr>
+          <w:lang w:val="en-US"/>
+        </w:rPr>
+        <w:t>In the next step, we will store the artefacts in Nexus Reposiotry. To have a success pipeline, I switch the quality gate to the default.</w:t>
+      </w:r>
+    </w:p>
+    <w:p>
+      <w:pPr>
+        <w:rPr>
+          <w:lang w:val="en-US"/>
+        </w:rPr>
+      </w:pPr>
+      <w:r>
+        <w:rPr>
+          <w:lang w:val="en-US"/>
+        </w:rPr>
+        <w:lastRenderedPageBreak/>
+        <w:t>Store Artifacts to Nexus Repository</w:t>
+      </w:r>
+    </w:p>
+    <w:p>
+      <w:pPr>
+        <w:rPr>
+          <w:lang w:val="en-US"/>
+        </w:rPr>
+      </w:pPr>
+      <w:r>
+        <w:rPr>
+          <w:lang w:val="en-US"/>
+        </w:rPr>
+        <w:t>First of all, run the Sonar server, take the public ip and connect to the browser with port 8081</w:t>
+      </w:r>
+    </w:p>
+    <w:p>
+      <w:pPr>
+        <w:rPr>
+          <w:lang w:val="en-US"/>
+        </w:rPr>
+      </w:pPr>
+      <w:r>
+        <w:rPr>
+          <w:lang w:val="en-US"/>
+        </w:rPr>
+        <w:t>Connect as admin (username = admin, password = admin123)</w:t>
+      </w:r>
+    </w:p>
+    <w:p>
+      <w:pPr>
+        <w:rPr>
+          <w:lang w:val="en-US"/>
+        </w:rPr>
+      </w:pPr>
+      <w:r>
+        <w:rPr>
+          <w:noProof/>
+          <w:lang w:val="en-US"/>
+        </w:rPr>
+        <w:drawing>
+          <wp:inline distT="0" distB="0" distL="0" distR="0" wp14:anchorId="4964CF86" wp14:editId="7FB70885">
+            <wp:extent cx="5760720" cy="1003935"/>
+            <wp:effectExtent l="0" t="0" r="0" b="5715"/>
+            <wp:docPr id="1493563340" name="Image 1" descr="Une image contenant texte, capture d’écran, logiciel, Logiciel multimédia&#10;&#10;Le contenu généré par l’IA peut être incorrect."/>
+            <wp:cNvGraphicFramePr>
+              <a:graphicFrameLocks xmlns:a="http://schemas.openxmlformats.org/drawingml/2006/main" noChangeAspect="1"/>
+            </wp:cNvGraphicFramePr>
+            <a:graphic xmlns:a="http://schemas.openxmlformats.org/drawingml/2006/main">
+              <a:graphicData uri="http://schemas.openxmlformats.org/drawingml/2006/picture">
+                <pic:pic xmlns:pic="http://schemas.openxmlformats.org/drawingml/2006/picture">
+                  <pic:nvPicPr>
+                    <pic:cNvPr id="1493563340" name="Image 1" descr="Une image contenant texte, capture d’écran, logiciel, Logiciel multimédia&#10;&#10;Le contenu généré par l’IA peut être incorrect."/>
+                    <pic:cNvPicPr/>
+                  </pic:nvPicPr>
+                  <pic:blipFill>
+                    <a:blip r:embed="rId40"/>
+                    <a:stretch>
+                      <a:fillRect/>
+                    </a:stretch>
+                  </pic:blipFill>
+                  <pic:spPr>
+                    <a:xfrm>
+                      <a:off x="0" y="0"/>
+                      <a:ext cx="5760720" cy="1003935"/>
+                    </a:xfrm>
+                    <a:prstGeom prst="rect">
+                      <a:avLst/>
+                    </a:prstGeom>
+                  </pic:spPr>
+                </pic:pic>
+              </a:graphicData>
+            </a:graphic>
+          </wp:inline>
+        </w:drawing>
+      </w:r>
+    </w:p>
+    <w:p>
+      <w:pPr>
+        <w:rPr>
+          <w:lang w:val="en-US"/>
+        </w:rPr>
+      </w:pPr>
+      <w:r>
+        <w:rPr>
+          <w:lang w:val="en-US"/>
+        </w:rPr>
+        <w:t>Click to the settings icon</w:t>
+      </w:r>
+    </w:p>
+    <w:p>
+      <w:pPr>
+        <w:rPr>
+          <w:lang w:val="en-US"/>
+        </w:rPr>
+      </w:pPr>
+      <w:r>
+        <w:rPr>
+          <w:lang w:val="en-US"/>
+        </w:rPr>
+        <w:t>Click to Repository</w:t>
+      </w:r>
+    </w:p>
+    <w:p>
+      <w:pPr>
+        <w:rPr>
+          <w:lang w:val="en-US"/>
+        </w:rPr>
+      </w:pPr>
+      <w:r>
+        <w:rPr>
+          <w:lang w:val="en-US"/>
+        </w:rPr>
+        <w:t>Click to create repository, scroll down and choose maven2(hosted)</w:t>
+      </w:r>
+    </w:p>
+    <w:p>
+      <w:pPr>
+        <w:rPr>
+          <w:lang w:val="en-US"/>
+        </w:rPr>
+      </w:pPr>
+      <w:r>
+        <w:rPr>
+          <w:lang w:val="en-US"/>
+        </w:rPr>
+        <w:t>Give the name : vprofile-repo and create the repository</w:t>
+      </w:r>
+    </w:p>
+    <w:p>
+      <w:pPr>
+        <w:rPr>
+          <w:lang w:val="en-US"/>
+        </w:rPr>
+      </w:pPr>
+    </w:p>
+    <w:p>
+      <w:pPr>
+        <w:rPr>
+          <w:lang w:val="en-US"/>
+        </w:rPr>
+      </w:pPr>
+      <w:r>
+        <w:rPr>
+          <w:lang w:val="en-US"/>
+        </w:rPr>
+        <w:t>Now, to allow Jenkins to push the artifacts to Nexus, we need to add Sonar credentials to Jenkins, follow the next steps</w:t>
+      </w:r>
+    </w:p>
+    <w:p>
+      <w:pPr>
+        <w:rPr>
+          <w:lang w:val="en-US"/>
+        </w:rPr>
+      </w:pPr>
+      <w:r>
+        <w:rPr>
+          <w:lang w:val="en-US"/>
+        </w:rPr>
+        <w:t>Go to Jenkins dashboard</w:t>
+      </w:r>
+    </w:p>
+    <w:p>
+      <w:pPr>
+        <w:rPr>
+          <w:lang w:val="en-US"/>
+        </w:rPr>
+      </w:pPr>
+      <w:r>
+        <w:rPr>
+          <w:lang w:val="en-US"/>
+        </w:rPr>
+        <w:t>Click to manage Jenkins</w:t>
+      </w:r>
+    </w:p>
+    <w:p>
+      <w:pPr>
+        <w:rPr>
+          <w:lang w:val="en-US"/>
+        </w:rPr>
+      </w:pPr>
+      <w:r>
+        <w:rPr>
+          <w:lang w:val="en-US"/>
+        </w:rPr>
+        <w:t>Scroll down and click to Credentials</w:t>
+      </w:r>
+    </w:p>
+    <w:p>
+      <w:pPr>
+        <w:rPr>
+          <w:lang w:val="en-US"/>
+        </w:rPr>
+      </w:pPr>
+      <w:r>
+        <w:rPr>
+          <w:lang w:val="en-US"/>
+        </w:rPr>
+        <w:t>In the stores scoped to Jenkins, click to System link</w:t>
+      </w:r>
+    </w:p>
+    <w:p>
+      <w:pPr>
+        <w:rPr>
+          <w:lang w:val="en-US"/>
+        </w:rPr>
+      </w:pPr>
+      <w:r>
+        <w:rPr>
+          <w:lang w:val="en-US"/>
+        </w:rPr>
+        <w:t>Click to global credentials</w:t>
+      </w:r>
+    </w:p>
+    <w:p>
+      <w:pPr>
+        <w:rPr>
+          <w:lang w:val="en-US"/>
+        </w:rPr>
+      </w:pPr>
+      <w:r>
+        <w:rPr>
+          <w:lang w:val="en-US"/>
+        </w:rPr>
+        <w:t>Click to Add credentials</w:t>
+      </w:r>
+    </w:p>
+    <w:p>
+      <w:pPr>
+        <w:rPr>
+          <w:lang w:val="en-US"/>
+        </w:rPr>
+      </w:pPr>
+      <w:r>
+        <w:rPr>
+          <w:lang w:val="en-US"/>
+        </w:rPr>
+        <w:t>Set (username = admin, password = admin123, ID = Description = nexuslogin)</w:t>
+      </w:r>
+    </w:p>
+    <w:p>
+      <w:pPr>
+        <w:rPr>
+          <w:lang w:val="en-US"/>
+        </w:rPr>
+      </w:pPr>
+      <w:r>
+        <w:rPr>
+          <w:lang w:val="en-US"/>
+        </w:rPr>
+        <w:t>Click to create</w:t>
+      </w:r>
+    </w:p>
+    <w:p>
+      <w:pPr>
+        <w:rPr>
+          <w:lang w:val="en-US"/>
+        </w:rPr>
+      </w:pPr>
+      <w:r>
+        <w:rPr>
+          <w:noProof/>
+          <w:lang w:val="en-US"/>
+        </w:rPr>
+        <w:lastRenderedPageBreak/>
+        <w:drawing>
+          <wp:inline distT="0" distB="0" distL="0" distR="0" wp14:anchorId="22074C5D" wp14:editId="2A35F3B2">
+            <wp:extent cx="5760720" cy="4170680"/>
+            <wp:effectExtent l="0" t="0" r="0" b="1270"/>
+            <wp:docPr id="1489058182" name="Image 1" descr="Une image contenant texte, capture d’écran, nombre, Police&#10;&#10;Le contenu généré par l’IA peut être incorrect."/>
+            <wp:cNvGraphicFramePr>
+              <a:graphicFrameLocks xmlns:a="http://schemas.openxmlformats.org/drawingml/2006/main" noChangeAspect="1"/>
+            </wp:cNvGraphicFramePr>
+            <a:graphic xmlns:a="http://schemas.openxmlformats.org/drawingml/2006/main">
+              <a:graphicData uri="http://schemas.openxmlformats.org/drawingml/2006/picture">
+                <pic:pic xmlns:pic="http://schemas.openxmlformats.org/drawingml/2006/picture">
+                  <pic:nvPicPr>
+                    <pic:cNvPr id="1489058182" name="Image 1" descr="Une image contenant texte, capture d’écran, nombre, Police&#10;&#10;Le contenu généré par l’IA peut être incorrect."/>
+                    <pic:cNvPicPr/>
+                  </pic:nvPicPr>
+                  <pic:blipFill>
+                    <a:blip r:embed="rId41"/>
+                    <a:stretch>
+                      <a:fillRect/>
+                    </a:stretch>
+                  </pic:blipFill>
+                  <pic:spPr>
+                    <a:xfrm>
+                      <a:off x="0" y="0"/>
+                      <a:ext cx="5760720" cy="4170680"/>
+                    </a:xfrm>
+                    <a:prstGeom prst="rect">
+                      <a:avLst/>
+                    </a:prstGeom>
+                  </pic:spPr>
+                </pic:pic>
+              </a:graphicData>
+            </a:graphic>
+          </wp:inline>
+        </w:drawing>
+      </w:r>
+    </w:p>
+    <w:p>
+      <w:pPr>
+        <w:rPr>
+          <w:lang w:val="en-US"/>
+        </w:rPr>
+      </w:pPr>
+    </w:p>
+    <w:p>
+      <w:pPr>
+        <w:rPr>
+          <w:lang w:val="en-US"/>
+        </w:rPr>
+      </w:pPr>
+      <w:r>
+        <w:rPr>
+          <w:lang w:val="en-US"/>
+        </w:rPr>
+        <w:t>The next step is to set up the stage to upload the artifacts to Nexus</w:t>
+      </w:r>
+    </w:p>
+    <w:p>
+      <w:pPr>
+        <w:rPr>
+          <w:lang w:val="en-US"/>
+        </w:rPr>
+      </w:pPr>
+      <w:r>
+        <w:rPr>
+          <w:lang w:val="en-US"/>
+        </w:rPr>
+        <w:t>Click to this link to show an exemple of the above code (Jenkins pipeline example)</w:t>
+      </w:r>
+    </w:p>
+    <w:p>
+      <w:pPr>
+        <w:rPr>
+          <w:lang w:val="en-US"/>
+        </w:rPr>
+      </w:pPr>
+      <w:r>
+        <w:rPr>
+          <w:lang w:val="en-US"/>
+        </w:rPr>
+        <w:t>Add this stage at the pipeline</w:t>
+      </w:r>
+    </w:p>
+    <w:p>
+      <w:pPr>
+        <w:rPr>
+          <w:lang w:val="en-US"/>
+        </w:rPr>
+      </w:pPr>
+      <w:r>
+        <w:rPr>
+          <w:lang w:val="en-US"/>
+        </w:rPr>
+        <w:t>stage('Upload Artifact') {</w:t>
+      </w:r>
+      <w:r>
+        <w:rPr>
+          <w:lang w:val="en-US"/>
+        </w:rPr>
+        <w:br/>
+        <w:t xml:space="preserve">    steps {</w:t>
+      </w:r>
+      <w:r>
+        <w:rPr>
+          <w:lang w:val="en-US"/>
+        </w:rPr>
+        <w:br/>
+        <w:t xml:space="preserve">        nexusArtifactUploader(</w:t>
+      </w:r>
+      <w:r>
+        <w:rPr>
+          <w:lang w:val="en-US"/>
+        </w:rPr>
+        <w:br/>
+        <w:t xml:space="preserve">            </w:t>
+      </w:r>
+      <w:r>
+        <w:rPr>
+          <w:i/>
+          <w:iCs/>
+          <w:lang w:val="en-US"/>
+        </w:rPr>
+        <w:t>nexusVersion</w:t>
+      </w:r>
+      <w:r>
+        <w:rPr>
+          <w:lang w:val="en-US"/>
+        </w:rPr>
+        <w:t>: 'nexus3',</w:t>
+      </w:r>
+      <w:r>
+        <w:rPr>
+          <w:lang w:val="en-US"/>
+        </w:rPr>
+        <w:br/>
+        <w:t xml:space="preserve">            </w:t>
+      </w:r>
+      <w:r>
+        <w:rPr>
+          <w:i/>
+          <w:iCs/>
+          <w:lang w:val="en-US"/>
+        </w:rPr>
+        <w:t>protocol</w:t>
+      </w:r>
+      <w:r>
+        <w:rPr>
+          <w:lang w:val="en-US"/>
+        </w:rPr>
+        <w:t>: 'http',</w:t>
+      </w:r>
+      <w:r>
+        <w:rPr>
+          <w:lang w:val="en-US"/>
+        </w:rPr>
+        <w:br/>
+        <w:t xml:space="preserve">            </w:t>
+      </w:r>
+      <w:r>
+        <w:rPr>
+          <w:i/>
+          <w:iCs/>
+          <w:lang w:val="en-US"/>
+        </w:rPr>
+        <w:t>nexusUrl</w:t>
+      </w:r>
+      <w:r>
+        <w:rPr>
+          <w:lang w:val="en-US"/>
+        </w:rPr>
+        <w:t>: '172.31.91.190:8081',</w:t>
+      </w:r>
+      <w:r>
+        <w:rPr>
+          <w:lang w:val="en-US"/>
+        </w:rPr>
+        <w:br/>
+        <w:t xml:space="preserve">            </w:t>
+      </w:r>
+      <w:r>
+        <w:rPr>
+          <w:i/>
+          <w:iCs/>
+          <w:lang w:val="en-US"/>
+        </w:rPr>
+        <w:t>groupId</w:t>
+      </w:r>
+      <w:r>
+        <w:rPr>
+          <w:lang w:val="en-US"/>
+        </w:rPr>
+        <w:t>: 'QA',</w:t>
+      </w:r>
+      <w:r>
+        <w:rPr>
+          <w:lang w:val="en-US"/>
+        </w:rPr>
+        <w:br/>
+        <w:t xml:space="preserve">            </w:t>
+      </w:r>
+      <w:r>
+        <w:rPr>
+          <w:i/>
+          <w:iCs/>
+          <w:lang w:val="en-US"/>
+        </w:rPr>
+        <w:t>version</w:t>
+      </w:r>
+      <w:r>
+        <w:rPr>
+          <w:lang w:val="en-US"/>
+        </w:rPr>
+        <w:t>: '${env.BUILD_ID}-${env.BUILD_TIMESTAMP}',</w:t>
+      </w:r>
+      <w:r>
+        <w:rPr>
+          <w:lang w:val="en-US"/>
+        </w:rPr>
+        <w:br/>
+        <w:t xml:space="preserve">            </w:t>
+      </w:r>
+      <w:r>
+        <w:rPr>
+          <w:i/>
+          <w:iCs/>
+          <w:lang w:val="en-US"/>
+        </w:rPr>
+        <w:t>repository</w:t>
+      </w:r>
+      <w:r>
+        <w:rPr>
+          <w:lang w:val="en-US"/>
+        </w:rPr>
+        <w:t>: 'vprofile-repo',</w:t>
+      </w:r>
+      <w:r>
+        <w:rPr>
+          <w:lang w:val="en-US"/>
+        </w:rPr>
+        <w:br/>
+        <w:t xml:space="preserve">            </w:t>
+      </w:r>
+      <w:r>
+        <w:rPr>
+          <w:i/>
+          <w:iCs/>
+          <w:lang w:val="en-US"/>
+        </w:rPr>
+        <w:t>credentialsId</w:t>
+      </w:r>
+      <w:r>
+        <w:rPr>
+          <w:lang w:val="en-US"/>
+        </w:rPr>
+        <w:t>: 'nexuslogin',</w:t>
+      </w:r>
+      <w:r>
+        <w:rPr>
+          <w:lang w:val="en-US"/>
+        </w:rPr>
+        <w:br/>
+        <w:t xml:space="preserve">            </w:t>
+      </w:r>
+      <w:r>
+        <w:rPr>
+          <w:i/>
+          <w:iCs/>
+          <w:lang w:val="en-US"/>
+        </w:rPr>
+        <w:t>artifacts</w:t>
+      </w:r>
+      <w:r>
+        <w:rPr>
+          <w:lang w:val="en-US"/>
+        </w:rPr>
+        <w:t>: [</w:t>
+      </w:r>
+      <w:r>
+        <w:rPr>
+          <w:lang w:val="en-US"/>
+        </w:rPr>
+        <w:br/>
+        <w:t xml:space="preserve">                [</w:t>
+      </w:r>
+      <w:r>
+        <w:rPr>
+          <w:i/>
+          <w:iCs/>
+          <w:lang w:val="en-US"/>
+        </w:rPr>
+        <w:t>artifactId</w:t>
+      </w:r>
+      <w:r>
+        <w:rPr>
+          <w:lang w:val="en-US"/>
+        </w:rPr>
+        <w:t>: 'vproapp',</w:t>
+      </w:r>
+      <w:r>
+        <w:rPr>
+          <w:lang w:val="en-US"/>
+        </w:rPr>
+        <w:br/>
+        <w:t xml:space="preserve">                 </w:t>
+      </w:r>
+      <w:r>
+        <w:rPr>
+          <w:i/>
+          <w:iCs/>
+          <w:lang w:val="en-US"/>
+        </w:rPr>
+        <w:t>classifier</w:t>
+      </w:r>
+      <w:r>
+        <w:rPr>
+          <w:lang w:val="en-US"/>
+        </w:rPr>
+        <w:t>: '',</w:t>
+      </w:r>
+      <w:r>
+        <w:rPr>
+          <w:lang w:val="en-US"/>
+        </w:rPr>
+        <w:br/>
+        <w:t xml:space="preserve">                 </w:t>
+      </w:r>
+      <w:r>
+        <w:rPr>
+          <w:i/>
+          <w:iCs/>
+          <w:lang w:val="en-US"/>
+        </w:rPr>
+        <w:t>file</w:t>
+      </w:r>
+      <w:r>
+        <w:rPr>
+          <w:lang w:val="en-US"/>
+        </w:rPr>
+        <w:t>: 'target/vprofile-v2.war',</w:t>
+      </w:r>
+      <w:r>
+        <w:rPr>
+          <w:lang w:val="en-US"/>
+        </w:rPr>
+        <w:br/>
+        <w:t xml:space="preserve">                 </w:t>
+      </w:r>
+      <w:r>
+        <w:rPr>
+          <w:i/>
+          <w:iCs/>
+          <w:lang w:val="en-US"/>
+        </w:rPr>
+        <w:t>type</w:t>
+      </w:r>
+      <w:r>
+        <w:rPr>
+          <w:lang w:val="en-US"/>
+        </w:rPr>
+        <w:t>: 'war'</w:t>
+      </w:r>
+      <w:r>
+        <w:rPr>
+          <w:lang w:val="en-US"/>
+        </w:rPr>
+        <w:br/>
+      </w:r>
+      <w:r>
+        <w:rPr>
+          <w:lang w:val="en-US"/>
+        </w:rPr>
+        <w:lastRenderedPageBreak/>
+        <w:t xml:space="preserve">                ]</w:t>
+      </w:r>
+      <w:r>
+        <w:rPr>
+          <w:lang w:val="en-US"/>
+        </w:rPr>
+        <w:br/>
+        <w:t xml:space="preserve">            ]</w:t>
+      </w:r>
+      <w:r>
+        <w:rPr>
+          <w:lang w:val="en-US"/>
+        </w:rPr>
+        <w:br/>
+        <w:t xml:space="preserve">        )</w:t>
+      </w:r>
+      <w:r>
+        <w:rPr>
+          <w:lang w:val="en-US"/>
+        </w:rPr>
+        <w:br/>
+        <w:t xml:space="preserve">    }</w:t>
+      </w:r>
+      <w:r>
+        <w:rPr>
+          <w:lang w:val="en-US"/>
+        </w:rPr>
+        <w:br/>
+        <w:t>}</w:t>
+      </w:r>
+    </w:p>
+    <w:p>
+      <w:pPr>
+        <w:rPr>
+          <w:lang w:val="en-US"/>
+        </w:rPr>
+      </w:pPr>
+      <w:r>
+        <w:rPr>
+          <w:lang w:val="en-US"/>
+        </w:rPr>
+        <w:t xml:space="preserve">Go to Jenkins and create </w:t>
+      </w:r>
+      <w:r>
+        <w:rPr>
+          <w:lang w:val="en-US"/>
+        </w:rPr>
+        <w:t>a new</w:t>
+      </w:r>
+      <w:r>
+        <w:rPr>
+          <w:lang w:val="en-US"/>
+        </w:rPr>
+        <w:t xml:space="preserve"> pipeline</w:t>
+      </w:r>
+    </w:p>
+    <w:p>
+      <w:pPr>
+        <w:rPr>
+          <w:lang w:val="en-US"/>
+        </w:rPr>
+      </w:pPr>
+    </w:p>
+    <w:p>
+      <w:pPr>
+        <w:rPr>
+          <w:lang w:val="en-US"/>
+        </w:rPr>
+      </w:pPr>
+      <w:r>
+        <w:rPr>
+          <w:lang w:val="en-US"/>
+        </w:rPr>
+        <w:t>Some times you will have this error, that means there is no node to execute the task</w:t>
+      </w:r>
+    </w:p>
+    <w:p>
+      <w:pPr>
+        <w:rPr>
+          <w:lang w:val="en-US"/>
+        </w:rPr>
+      </w:pPr>
+      <w:r>
+        <w:rPr>
+          <w:noProof/>
+          <w:lang w:val="en-US"/>
+        </w:rPr>
+        <w:drawing>
+          <wp:inline distT="0" distB="0" distL="0" distR="0" wp14:anchorId="23AAB143" wp14:editId="6720D17F">
+            <wp:extent cx="5760720" cy="1328420"/>
+            <wp:effectExtent l="0" t="0" r="0" b="5080"/>
+            <wp:docPr id="1670431275" name="Image 1" descr="Une image contenant texte, Police, capture d’écran&#10;&#10;Le contenu généré par l’IA peut être incorrect."/>
+            <wp:cNvGraphicFramePr>
+              <a:graphicFrameLocks xmlns:a="http://schemas.openxmlformats.org/drawingml/2006/main" noChangeAspect="1"/>
+            </wp:cNvGraphicFramePr>
+            <a:graphic xmlns:a="http://schemas.openxmlformats.org/drawingml/2006/main">
+              <a:graphicData uri="http://schemas.openxmlformats.org/drawingml/2006/picture">
+                <pic:pic xmlns:pic="http://schemas.openxmlformats.org/drawingml/2006/picture">
+                  <pic:nvPicPr>
+                    <pic:cNvPr id="1670431275" name="Image 1" descr="Une image contenant texte, Police, capture d’écran&#10;&#10;Le contenu généré par l’IA peut être incorrect."/>
+                    <pic:cNvPicPr/>
+                  </pic:nvPicPr>
+                  <pic:blipFill>
+                    <a:blip r:embed="rId42"/>
+                    <a:stretch>
+                      <a:fillRect/>
+                    </a:stretch>
+                  </pic:blipFill>
+                  <pic:spPr>
+                    <a:xfrm>
+                      <a:off x="0" y="0"/>
+                      <a:ext cx="5760720" cy="1328420"/>
+                    </a:xfrm>
+                    <a:prstGeom prst="rect">
+                      <a:avLst/>
+                    </a:prstGeom>
+                  </pic:spPr>
+                </pic:pic>
+              </a:graphicData>
+            </a:graphic>
+          </wp:inline>
+        </w:drawing>
+      </w:r>
+    </w:p>
+    <w:p>
+      <w:pPr>
+        <w:rPr>
+          <w:lang w:val="en-US"/>
+        </w:rPr>
+      </w:pPr>
+    </w:p>
+    <w:p>
+      <w:pPr>
+        <w:rPr>
+          <w:lang w:val="en-US"/>
+        </w:rPr>
+      </w:pPr>
+      <w:r>
+        <w:rPr>
+          <w:lang w:val="en-US"/>
+        </w:rPr>
+        <w:t xml:space="preserve">To fix it, </w:t>
+      </w:r>
+    </w:p>
+    <w:p>
+      <w:pPr>
+        <w:rPr>
+          <w:lang w:val="en-US"/>
+        </w:rPr>
+      </w:pPr>
+      <w:r>
+        <w:rPr>
+          <w:lang w:val="en-US"/>
+        </w:rPr>
+        <w:t>connect to Jenkins server using ssh</w:t>
+      </w:r>
+    </w:p>
+    <w:p>
+      <w:pPr>
+        <w:rPr>
+          <w:lang w:val="en-US"/>
+        </w:rPr>
+      </w:pPr>
+      <w:r>
+        <w:rPr>
+          <w:lang w:val="en-US"/>
+        </w:rPr>
+        <w:t>switch to rrot user : sudo -i</w:t>
+      </w:r>
+    </w:p>
+    <w:p>
+      <w:pPr>
+        <w:rPr>
+          <w:lang w:val="en-US"/>
+        </w:rPr>
+      </w:pPr>
+      <w:r>
+        <w:rPr>
+          <w:lang w:val="en-US"/>
+        </w:rPr>
+        <w:t>Go to Workspace o Jenkins path : cd /var/lib/Jenkins/workspace</w:t>
+      </w:r>
+    </w:p>
+    <w:p>
+      <w:pPr>
+        <w:rPr>
+          <w:lang w:val="en-US"/>
+        </w:rPr>
+      </w:pPr>
+      <w:r>
+        <w:rPr>
+          <w:lang w:val="en-US"/>
+        </w:rPr>
+        <w:t>Delete all pipeline ; rm -rf * (Be sur to be under the folder workspace</w:t>
+      </w:r>
+    </w:p>
+    <w:p>
+      <w:pPr>
+        <w:rPr>
+          <w:lang w:val="de-DE"/>
+        </w:rPr>
+      </w:pPr>
+      <w:r>
+        <w:rPr>
+          <w:lang w:val="de-DE"/>
+        </w:rPr>
+        <w:t>Restart Jenkins : systemctl restart jen</w:t>
+      </w:r>
+      <w:r>
+        <w:rPr>
+          <w:lang w:val="de-DE"/>
+        </w:rPr>
+        <w:t>kins</w:t>
+      </w:r>
+    </w:p>
+    <w:p>
+      <w:pPr>
+        <w:rPr>
+          <w:lang w:val="en-US"/>
+        </w:rPr>
+      </w:pPr>
+      <w:r>
+        <w:rPr>
+          <w:lang w:val="en-US"/>
+        </w:rPr>
+        <w:t xml:space="preserve">Finally, the pipeline is a </w:t>
+      </w:r>
+      <w:r>
+        <w:rPr>
+          <w:lang w:val="en-US"/>
+        </w:rPr>
+        <w:t>success and the artifacts are uploaded into Nexus</w:t>
+      </w:r>
+    </w:p>
+    <w:p>
+      <w:pPr>
+        <w:rPr>
+          <w:lang w:val="en-US"/>
+        </w:rPr>
+      </w:pPr>
+      <w:r>
+        <w:rPr>
+          <w:lang w:val="en-US"/>
+        </w:rPr>
+        <w:drawing>
+          <wp:inline distT="0" distB="0" distL="0" distR="0" wp14:anchorId="1F052F1F" wp14:editId="7F547659">
+            <wp:extent cx="5760720" cy="1238250"/>
+            <wp:effectExtent l="0" t="0" r="0" b="0"/>
+            <wp:docPr id="1373351626" name="Image 1" descr="Une image contenant texte, capture d’écran, logiciel, Page web&#10;&#10;Le contenu généré par l’IA peut être incorrect."/>
+            <wp:cNvGraphicFramePr>
+              <a:graphicFrameLocks xmlns:a="http://schemas.openxmlformats.org/drawingml/2006/main" noChangeAspect="1"/>
+            </wp:cNvGraphicFramePr>
+            <a:graphic xmlns:a="http://schemas.openxmlformats.org/drawingml/2006/main">
+              <a:graphicData uri="http://schemas.openxmlformats.org/drawingml/2006/picture">
+                <pic:pic xmlns:pic="http://schemas.openxmlformats.org/drawingml/2006/picture">
+                  <pic:nvPicPr>
+                    <pic:cNvPr id="1373351626" name="Image 1" descr="Une image contenant texte, capture d’écran, logiciel, Page web&#10;&#10;Le contenu généré par l’IA peut être incorrect."/>
+                    <pic:cNvPicPr/>
+                  </pic:nvPicPr>
+                  <pic:blipFill>
+                    <a:blip r:embed="rId43"/>
+                    <a:stretch>
+                      <a:fillRect/>
+                    </a:stretch>
+                  </pic:blipFill>
+                  <pic:spPr>
+                    <a:xfrm>
+                      <a:off x="0" y="0"/>
+                      <a:ext cx="5760720" cy="1238250"/>
+                    </a:xfrm>
+                    <a:prstGeom prst="rect">
+                      <a:avLst/>
+                    </a:prstGeom>
+                  </pic:spPr>
+                </pic:pic>
+              </a:graphicData>
+            </a:graphic>
+          </wp:inline>
+        </w:drawing>
+      </w:r>
+    </w:p>
+    <w:p>
+      <w:pPr>
+        <w:rPr>
+          <w:lang w:val="en-US"/>
+        </w:rPr>
+      </w:pPr>
+      <w:r>
+        <w:rPr>
+          <w:lang w:val="en-US"/>
+        </w:rPr>
+        <w:lastRenderedPageBreak/>
+        <w:br/>
+      </w:r>
+      <w:r>
+        <w:rPr>
+          <w:lang w:val="en-US"/>
+        </w:rPr>
+        <w:drawing>
+          <wp:inline distT="0" distB="0" distL="0" distR="0" wp14:anchorId="14449E8A" wp14:editId="378CB5BF">
+            <wp:extent cx="5760720" cy="3157220"/>
+            <wp:effectExtent l="0" t="0" r="0" b="5080"/>
+            <wp:docPr id="485249964" name="Image 1" descr="Une image contenant texte, capture d’écran, logiciel, Icône d’ordinateur&#10;&#10;Le contenu généré par l’IA peut être incorrect."/>
+            <wp:cNvGraphicFramePr>
+              <a:graphicFrameLocks xmlns:a="http://schemas.openxmlformats.org/drawingml/2006/main" noChangeAspect="1"/>
+            </wp:cNvGraphicFramePr>
+            <a:graphic xmlns:a="http://schemas.openxmlformats.org/drawingml/2006/main">
+              <a:graphicData uri="http://schemas.openxmlformats.org/drawingml/2006/picture">
+                <pic:pic xmlns:pic="http://schemas.openxmlformats.org/drawingml/2006/picture">
+                  <pic:nvPicPr>
+                    <pic:cNvPr id="485249964" name="Image 1" descr="Une image contenant texte, capture d’écran, logiciel, Icône d’ordinateur&#10;&#10;Le contenu généré par l’IA peut être incorrect."/>
+                    <pic:cNvPicPr/>
+                  </pic:nvPicPr>
+                  <pic:blipFill>
+                    <a:blip r:embed="rId44"/>
+                    <a:stretch>
+                      <a:fillRect/>
+                    </a:stretch>
+                  </pic:blipFill>
+                  <pic:spPr>
+                    <a:xfrm>
+                      <a:off x="0" y="0"/>
+                      <a:ext cx="5760720" cy="3157220"/>
+                    </a:xfrm>
+                    <a:prstGeom prst="rect">
+                      <a:avLst/>
+                    </a:prstGeom>
+                  </pic:spPr>
+                </pic:pic>
+              </a:graphicData>
+            </a:graphic>
+          </wp:inline>
+        </w:drawing>
+      </w:r>
+    </w:p>
+    <w:p>
+      <w:pPr>
+        <w:rPr>
+          <w:lang w:val="en-US"/>
+        </w:rPr>
+      </w:pPr>
+    </w:p>
+    <w:p>
+      <w:pPr>
+        <w:rPr>
+          <w:lang w:val="en-US"/>
+        </w:rPr>
+      </w:pPr>
+    </w:p>
+    <w:p>
+      <w:pPr>
+        <w:rPr>
+          <w:lang w:val="en-US"/>
+        </w:rPr>
+      </w:pPr>
+      <w:r>
+        <w:rPr>
+          <w:lang w:val="en-US"/>
+        </w:rPr>
+        <w:t>Notification with Slack</w:t>
+      </w:r>
+    </w:p>
+    <w:p>
+      <w:pPr>
+        <w:rPr>
+          <w:lang w:val="en-US"/>
+        </w:rPr>
+      </w:pPr>
+      <w:r>
+        <w:rPr>
+          <w:lang w:val="en-US"/>
+        </w:rPr>
+        <w:t>First of all, you need to have a slack account connected to the browser.</w:t>
+      </w:r>
+    </w:p>
+    <w:p>
+      <w:pPr>
+        <w:rPr>
+          <w:lang w:val="en-US"/>
+        </w:rPr>
+      </w:pPr>
+      <w:r>
+        <w:rPr>
+          <w:lang w:val="en-US"/>
+        </w:rPr>
+        <w:t>To configure Jenkins to send notification to slack channel, go to the market place of slack (</w:t>
+      </w:r>
+      <w:hyperlink r:id="rId45" w:history="1">
+        <w:r>
+          <w:rPr>
+            <w:rStyle w:val="Lienhypertexte"/>
+            <w:lang w:val="en-US"/>
+          </w:rPr>
+          <w:t>https://</w:t>
+        </w:r>
+        <w:r>
+          <w:rPr>
+            <w:rStyle w:val="Lienhypertexte"/>
+            <w:lang w:val="en-US"/>
+          </w:rPr>
+          <w:t>your-slack-account</w:t>
+        </w:r>
+        <w:r>
+          <w:rPr>
+            <w:rStyle w:val="Lienhypertexte"/>
+            <w:lang w:val="en-US"/>
+          </w:rPr>
+          <w:t>.slack.com/marketplace</w:t>
+        </w:r>
+      </w:hyperlink>
+      <w:r>
+        <w:rPr>
+          <w:lang w:val="en-US"/>
+        </w:rPr>
+        <w:t>)</w:t>
+      </w:r>
+    </w:p>
+    <w:p>
+      <w:pPr>
+        <w:rPr>
+          <w:lang w:val="en-US"/>
+        </w:rPr>
+      </w:pPr>
+      <w:r>
+        <w:rPr>
+          <w:lang w:val="en-US"/>
+        </w:rPr>
+        <w:t>Search Jenkins</w:t>
+      </w:r>
+    </w:p>
+    <w:p>
+      <w:pPr>
+        <w:rPr>
+          <w:lang w:val="en-US"/>
+        </w:rPr>
+      </w:pPr>
+      <w:r>
+        <w:rPr>
+          <w:lang w:val="en-US"/>
+        </w:rPr>
+        <w:t>Click to Jenkins CI</w:t>
+      </w:r>
+    </w:p>
+    <w:p>
+      <w:pPr>
+        <w:rPr>
+          <w:lang w:val="en-US"/>
+        </w:rPr>
+      </w:pPr>
+      <w:r>
+        <w:rPr>
+          <w:lang w:val="en-US"/>
+        </w:rPr>
+        <w:t>Click to Add Slack</w:t>
+      </w:r>
+    </w:p>
+    <w:p>
+      <w:pPr>
+        <w:rPr>
+          <w:lang w:val="en-US"/>
+        </w:rPr>
+      </w:pPr>
+      <w:r>
+        <w:rPr>
+          <w:lang w:val="en-US"/>
+        </w:rPr>
+        <w:t>Choose a chanel in the select list or create one</w:t>
+      </w:r>
+    </w:p>
+    <w:p>
+      <w:pPr>
+        <w:rPr>
+          <w:lang w:val="en-US"/>
+        </w:rPr>
+      </w:pPr>
+      <w:r>
+        <w:rPr>
+          <w:lang w:val="en-US"/>
+        </w:rPr>
+        <w:t>Click to Add Jenkins CI integration</w:t>
+      </w:r>
+    </w:p>
+    <w:p>
+      <w:pPr>
+        <w:rPr>
+          <w:lang w:val="en-US"/>
+        </w:rPr>
+      </w:pPr>
+      <w:r>
+        <w:rPr>
+          <w:lang w:val="en-US"/>
+        </w:rPr>
+        <w:t>And you will have all the next steps in the next page of slack</w:t>
+      </w:r>
+      <w:r>
+        <w:rPr>
+          <w:lang w:val="en-US"/>
+        </w:rPr>
+        <w:br/>
+      </w:r>
+      <w:r>
+        <w:rPr>
+          <w:lang w:val="en-US"/>
+        </w:rPr>
+        <w:br/>
+      </w:r>
+    </w:p>
+    <w:p>
+      <w:pPr>
+        <w:rPr>
+          <w:lang w:val="en-US"/>
+        </w:rPr>
+      </w:pPr>
+      <w:r>
+        <w:rPr>
+          <w:lang w:val="en-US"/>
+        </w:rPr>
+        <w:br w:type="page"/>
+      </w:r>
+    </w:p>
+    <w:p>
+      <w:pPr>
+        <w:rPr>
+          <w:lang w:val="en-US"/>
+        </w:rPr>
+      </w:pPr>
+      <w:r>
+        <w:rPr>
+          <w:lang w:val="en-US"/>
+        </w:rPr>
+        <w:lastRenderedPageBreak/>
+        <w:t>After this configuration, you will add to the pipeline a post section after stages section to send the notification.</w:t>
+      </w:r>
+    </w:p>
+    <w:p>
+      <w:pPr>
+        <w:rPr>
+          <w:lang w:val="en-US"/>
+        </w:rPr>
+      </w:pPr>
+      <w:r>
+        <w:rPr>
+          <w:lang w:val="en-US"/>
+        </w:rPr>
+        <w:t>post {</w:t>
+      </w:r>
+      <w:r>
+        <w:rPr>
+          <w:lang w:val="en-US"/>
+        </w:rPr>
+        <w:br/>
+        <w:t xml:space="preserve">    always {</w:t>
+      </w:r>
+      <w:r>
+        <w:rPr>
+          <w:lang w:val="en-US"/>
+        </w:rPr>
+        <w:br/>
+        <w:t xml:space="preserve">        echo 'Slack Notification'</w:t>
+      </w:r>
+      <w:r>
+        <w:rPr>
+          <w:lang w:val="en-US"/>
+        </w:rPr>
+        <w:br/>
+        <w:t xml:space="preserve">        slackSend </w:t>
+      </w:r>
+      <w:r>
+        <w:rPr>
+          <w:i/>
+          <w:iCs/>
+          <w:lang w:val="en-US"/>
+        </w:rPr>
+        <w:t>channel</w:t>
+      </w:r>
+      <w:r>
+        <w:rPr>
+          <w:lang w:val="en-US"/>
+        </w:rPr>
+        <w:t>: '#devopscicd',</w:t>
+      </w:r>
+      <w:r>
+        <w:rPr>
+          <w:lang w:val="en-US"/>
+        </w:rPr>
+        <w:br/>
+        <w:t xml:space="preserve">        </w:t>
+      </w:r>
+      <w:r>
+        <w:rPr>
+          <w:i/>
+          <w:iCs/>
+          <w:lang w:val="en-US"/>
+        </w:rPr>
+        <w:t xml:space="preserve">color </w:t>
+      </w:r>
+      <w:r>
+        <w:rPr>
+          <w:lang w:val="en-US"/>
+        </w:rPr>
+        <w:t xml:space="preserve">: </w:t>
+      </w:r>
+      <w:r>
+        <w:rPr>
+          <w:i/>
+          <w:iCs/>
+          <w:lang w:val="en-US"/>
+        </w:rPr>
+        <w:t>COLOR_MAP</w:t>
+      </w:r>
+      <w:r>
+        <w:rPr>
+          <w:lang w:val="en-US"/>
+        </w:rPr>
+        <w:t>[currentBuild.currentResult],</w:t>
+      </w:r>
+      <w:r>
+        <w:rPr>
+          <w:lang w:val="en-US"/>
+        </w:rPr>
+        <w:br/>
+        <w:t xml:space="preserve">        </w:t>
+      </w:r>
+      <w:r>
+        <w:rPr>
+          <w:i/>
+          <w:iCs/>
+          <w:lang w:val="en-US"/>
+        </w:rPr>
+        <w:t>message</w:t>
+      </w:r>
+      <w:r>
+        <w:rPr>
+          <w:lang w:val="en-US"/>
+        </w:rPr>
+        <w:t xml:space="preserve">: "Find Status of Pipeline:- ${currentBuild.currentResult}:* Job ${env.JOB_NAME} ${env.BUILD_NUMBER} </w:t>
+      </w:r>
+      <w:r>
+        <w:rPr>
+          <w:i/>
+          <w:iCs/>
+          <w:lang w:val="en-US"/>
+        </w:rPr>
+        <w:t>\n</w:t>
+      </w:r>
+      <w:r>
+        <w:rPr>
+          <w:lang w:val="en-US"/>
+        </w:rPr>
+        <w:t xml:space="preserve"> For more information go to url ${BUILD_URL}"</w:t>
+      </w:r>
+      <w:r>
+        <w:rPr>
+          <w:lang w:val="en-US"/>
+        </w:rPr>
+        <w:br/>
+        <w:t xml:space="preserve">    }</w:t>
+      </w:r>
+      <w:r>
+        <w:rPr>
+          <w:lang w:val="en-US"/>
+        </w:rPr>
+        <w:br/>
+        <w:t>}</w:t>
+      </w:r>
+    </w:p>
+    <w:p>
+      <w:pPr>
+        <w:rPr>
+          <w:lang w:val="en-US"/>
+        </w:rPr>
+      </w:pPr>
+    </w:p>
+    <w:p>
+      <w:pPr>
+        <w:rPr>
+          <w:lang w:val="en-US"/>
+        </w:rPr>
+      </w:pPr>
+      <w:r>
+        <w:rPr>
+          <w:lang w:val="en-US"/>
+        </w:rPr>
+        <w:t>The function below is to put before pipelines section</w:t>
+      </w:r>
+    </w:p>
+    <w:p>
+      <w:pPr>
+        <w:rPr>
+          <w:lang w:val="en-US"/>
+        </w:rPr>
+      </w:pPr>
+      <w:r>
+        <w:rPr>
+          <w:lang w:val="en-US"/>
+        </w:rPr>
+        <w:t xml:space="preserve">def </w:t>
+      </w:r>
+      <w:r>
+        <w:rPr>
+          <w:i/>
+          <w:iCs/>
+          <w:lang w:val="en-US"/>
+        </w:rPr>
+        <w:t xml:space="preserve">COLOR_MAP </w:t>
+      </w:r>
+      <w:r>
+        <w:rPr>
+          <w:lang w:val="en-US"/>
+        </w:rPr>
+        <w:t>= [</w:t>
+      </w:r>
+      <w:r>
+        <w:rPr>
+          <w:lang w:val="en-US"/>
+        </w:rPr>
+        <w:br/>
+        <w:t xml:space="preserve">    'SUCCESS': 'good',</w:t>
+      </w:r>
+      <w:r>
+        <w:rPr>
+          <w:lang w:val="en-US"/>
+        </w:rPr>
+        <w:br/>
+        <w:t xml:space="preserve">    'FAILURE' : 'danger'</w:t>
+      </w:r>
+      <w:r>
+        <w:rPr>
+          <w:lang w:val="en-US"/>
+        </w:rPr>
+        <w:br/>
+        <w:t>]</w:t>
+      </w:r>
+    </w:p>
+    <w:p>
+      <w:pPr>
+        <w:rPr>
+          <w:lang w:val="en-US"/>
+        </w:rPr>
+      </w:pPr>
+    </w:p>
+    <w:p>
+      <w:pPr>
+        <w:rPr>
+          <w:lang w:val="en-US"/>
+        </w:rPr>
+      </w:pPr>
+      <w:r>
+        <w:rPr>
+          <w:lang w:val="en-US"/>
+        </w:rPr>
+        <w:t>The pipeline is a success and I received the notification in slack</w:t>
+      </w:r>
+    </w:p>
+    <w:p>
+      <w:pPr>
+        <w:rPr>
+          <w:lang w:val="en-US"/>
+        </w:rPr>
+      </w:pPr>
+      <w:r>
+        <w:rPr>
+          <w:lang w:val="en-US"/>
+        </w:rPr>
+        <w:drawing>
+          <wp:inline distT="0" distB="0" distL="0" distR="0" wp14:anchorId="15049263" wp14:editId="4CB8B0E9">
+            <wp:extent cx="5760720" cy="2842895"/>
+            <wp:effectExtent l="0" t="0" r="0" b="0"/>
+            <wp:docPr id="1264272860" name="Image 1" descr="Une image contenant texte, capture d’écran, logiciel, Logiciel multimédia&#10;&#10;Le contenu généré par l’IA peut être incorrect."/>
+            <wp:cNvGraphicFramePr>
+              <a:graphicFrameLocks xmlns:a="http://schemas.openxmlformats.org/drawingml/2006/main" noChangeAspect="1"/>
+            </wp:cNvGraphicFramePr>
+            <a:graphic xmlns:a="http://schemas.openxmlformats.org/drawingml/2006/main">
+              <a:graphicData uri="http://schemas.openxmlformats.org/drawingml/2006/picture">
+                <pic:pic xmlns:pic="http://schemas.openxmlformats.org/drawingml/2006/picture">
+                  <pic:nvPicPr>
+                    <pic:cNvPr id="1264272860" name="Image 1" descr="Une image contenant texte, capture d’écran, logiciel, Logiciel multimédia&#10;&#10;Le contenu généré par l’IA peut être incorrect."/>
+                    <pic:cNvPicPr/>
+                  </pic:nvPicPr>
+                  <pic:blipFill>
+                    <a:blip r:embed="rId46"/>
+                    <a:stretch>
+                      <a:fillRect/>
+                    </a:stretch>
+                  </pic:blipFill>
+                  <pic:spPr>
+                    <a:xfrm>
+                      <a:off x="0" y="0"/>
+                      <a:ext cx="5760720" cy="2842895"/>
+                    </a:xfrm>
+                    <a:prstGeom prst="rect">
+                      <a:avLst/>
+                    </a:prstGeom>
+                  </pic:spPr>
+                </pic:pic>
+              </a:graphicData>
+            </a:graphic>
+          </wp:inline>
+        </w:drawing>
+      </w:r>
+    </w:p>
+    <w:p>
+      <w:pPr>
+        <w:rPr>
+          <w:lang w:val="en-US"/>
+        </w:rPr>
+      </w:pPr>
+      <w:r>
+        <w:rPr>
+          <w:lang w:val="en-US"/>
+        </w:rPr>
+        <w:lastRenderedPageBreak/>
+        <w:drawing>
+          <wp:inline distT="0" distB="0" distL="0" distR="0" wp14:anchorId="3023888A" wp14:editId="0B3E85B5">
+            <wp:extent cx="5760720" cy="3115945"/>
+            <wp:effectExtent l="0" t="0" r="0" b="8255"/>
+            <wp:docPr id="873571508" name="Image 1" descr="Une image contenant texte, capture d’écran, logiciel, nombre&#10;&#10;Le contenu généré par l’IA peut être incorrect."/>
+            <wp:cNvGraphicFramePr>
+              <a:graphicFrameLocks xmlns:a="http://schemas.openxmlformats.org/drawingml/2006/main" noChangeAspect="1"/>
+            </wp:cNvGraphicFramePr>
+            <a:graphic xmlns:a="http://schemas.openxmlformats.org/drawingml/2006/main">
+              <a:graphicData uri="http://schemas.openxmlformats.org/drawingml/2006/picture">
+                <pic:pic xmlns:pic="http://schemas.openxmlformats.org/drawingml/2006/picture">
+                  <pic:nvPicPr>
+                    <pic:cNvPr id="873571508" name="Image 1" descr="Une image contenant texte, capture d’écran, logiciel, nombre&#10;&#10;Le contenu généré par l’IA peut être incorrect."/>
+                    <pic:cNvPicPr/>
+                  </pic:nvPicPr>
+                  <pic:blipFill>
+                    <a:blip r:embed="rId47"/>
+                    <a:stretch>
+                      <a:fillRect/>
+                    </a:stretch>
+                  </pic:blipFill>
+                  <pic:spPr>
+                    <a:xfrm>
+                      <a:off x="0" y="0"/>
+                      <a:ext cx="5760720" cy="3115945"/>
+                    </a:xfrm>
+                    <a:prstGeom prst="rect">
+                      <a:avLst/>
+                    </a:prstGeom>
+                  </pic:spPr>
+                </pic:pic>
+              </a:graphicData>
+            </a:graphic>
+          </wp:inline>
+        </w:drawing>
+      </w:r>
+    </w:p>
+    <w:p>
+      <w:pPr>
+        <w:rPr>
+          <w:lang w:val="en-US"/>
+        </w:rPr>
+      </w:pPr>
+    </w:p>
+    <w:p>
+      <w:pPr>
+        <w:rPr>
+          <w:lang w:val="en-US"/>
+        </w:rPr>
+      </w:pPr>
     </w:p>
     <w:sectPr>
+      <w:footerReference w:type="default" r:id="rId48"/>
       <w:pgSz w:w="11906" w:h="16838"/>
       <w:pgMar w:top="1417" w:right="1417" w:bottom="1417" w:left="1417" w:header="708" w:footer="708" w:gutter="0"/>
       <w:cols w:space="708"/>
@@ -2309,6 +6626,48 @@
     </w:p>
   </w:endnote>
 </w:endnotes>
+</file>
+
+<file path=word/footer1.xml><?xml version="1.0" encoding="utf-8"?>
+<w:ftr xmlns:wpc="http://schemas.microsoft.com/office/word/2010/wordprocessingCanvas" xmlns:cx="http://schemas.microsoft.com/office/drawing/2014/chartex" xmlns:cx1="http://schemas.microsoft.com/office/drawing/2015/9/8/chartex" xmlns:cx2="http://schemas.microsoft.com/office/drawing/2015/10/21/chartex" xmlns:cx3="http://schemas.microsoft.com/office/drawing/2016/5/9/chartex" xmlns:cx4="http://schemas.microsoft.com/office/drawing/2016/5/10/chartex" xmlns:cx5="http://schemas.microsoft.com/office/drawing/2016/5/11/chartex" xmlns:cx6="http://schemas.microsoft.com/office/drawing/2016/5/12/chartex" xmlns:cx7="http://schemas.microsoft.com/office/drawing/2016/5/13/chartex" xmlns:cx8="http://schemas.microsoft.com/office/drawing/2016/5/14/chartex" xmlns:mc="http://schemas.openxmlformats.org/markup-compatibility/2006" xmlns:aink="http://schemas.microsoft.com/office/drawing/2016/ink" xmlns:am3d="http://schemas.microsoft.com/office/drawing/2017/model3d" xmlns:o="urn:schemas-microsoft-com:office:office" xmlns:oel="http://schemas.microsoft.com/office/2019/extlst" xmlns:r="http://schemas.openxmlformats.org/officeDocument/2006/relationships" xmlns:m="http://schemas.openxmlformats.org/officeDocument/2006/math" xmlns:v="urn:schemas-microsoft-com:vml" xmlns:wp14="http://schemas.microsoft.com/office/word/2010/wordprocessingDrawing" xmlns:wp="http://schemas.openxmlformats.org/drawingml/2006/wordprocessingDrawing" xmlns:w10="urn:schemas-microsoft-com:office:word" xmlns:w="http://schemas.openxmlformats.org/wordprocessingml/2006/main" xmlns:w14="http://schemas.microsoft.com/office/word/2010/wordml" xmlns:w15="http://schemas.microsoft.com/office/word/2012/wordml" xmlns:w16cex="http://schemas.microsoft.com/office/word/2018/wordml/cex" xmlns:w16cid="http://schemas.microsoft.com/office/word/2016/wordml/cid" xmlns:w16="http://schemas.microsoft.com/office/word/2018/wordml" xmlns:w16du="http://schemas.microsoft.com/office/word/2023/wordml/word16du" xmlns:w16sdtdh="http://schemas.microsoft.com/office/word/2020/wordml/sdtdatahash" xmlns:w16sdtfl="http://schemas.microsoft.com/office/word/2024/wordml/sdtformatlock" xmlns:w16se="http://schemas.microsoft.com/office/word/2015/wordml/symex" xmlns:wpg="http://schemas.microsoft.com/office/word/2010/wordprocessingGroup" xmlns:wpi="http://schemas.microsoft.com/office/word/2010/wordprocessingInk" xmlns:wne="http://schemas.microsoft.com/office/word/2006/wordml" xmlns:wps="http://schemas.microsoft.com/office/word/2010/wordprocessingShape" mc:Ignorable="w14 w15 w16se w16cid w16 w16cex w16sdtdh w16sdtfl w16du wp14">
+  <w:sdt>
+    <w:sdtPr>
+      <w:id w:val="693958821"/>
+      <w:docPartObj>
+        <w:docPartGallery w:val="Page Numbers (Bottom of Page)"/>
+        <w:docPartUnique/>
+      </w:docPartObj>
+    </w:sdtPr>
+    <w:sdtContent>
+      <w:p>
+        <w:pPr>
+          <w:pStyle w:val="Pieddepage"/>
+          <w:jc w:val="right"/>
+        </w:pPr>
+        <w:r>
+          <w:fldChar w:fldCharType="begin"/>
+        </w:r>
+        <w:r>
+          <w:instrText>PAGE   \* MERGEFORMAT</w:instrText>
+        </w:r>
+        <w:r>
+          <w:fldChar w:fldCharType="separate"/>
+        </w:r>
+        <w:r>
+          <w:t>2</w:t>
+        </w:r>
+        <w:r>
+          <w:fldChar w:fldCharType="end"/>
+        </w:r>
+      </w:p>
+    </w:sdtContent>
+  </w:sdt>
+  <w:p>
+    <w:pPr>
+      <w:pStyle w:val="Pieddepage"/>
+    </w:pPr>
+  </w:p>
+</w:ftr>
 </file>
 
 <file path=word/footnotes.xml><?xml version="1.0" encoding="utf-8"?>
@@ -2940,7 +7299,6 @@
   <w:style w:type="character" w:default="1" w:styleId="Policepardfaut">
     <w:name w:val="Default Paragraph Font"/>
     <w:uiPriority w:val="1"/>
-    <w:semiHidden/>
     <w:unhideWhenUsed/>
   </w:style>
   <w:style w:type="table" w:default="1" w:styleId="TableauNormal">

</xml_diff>